<commit_message>
fix(manuscript): reconcile biostatistical review critiques, sample accounting, verified DOIs, and updated figures
</commit_message>
<xml_diff>
--- a/Brain_MRI_Research_Paper_Final.docx
+++ b/Brain_MRI_Research_Paper_Final.docx
@@ -165,7 +165,7 @@
           <w:i w:val="0"/>
           <w:sz w:val="20"/>
         </w:rPr>
-        <w:t>Deep convolutional neural networks (CNNs) and Vision Transformers (ViTs) regularly report high benchmark accuracy for classifying intracranial neoplasms from contrast-enhanced magnetic resonance imaging (CE-MRI). However, standard evaluation protocols fail to disentangle whether high diagnostic accuracy reflects genuine reliance on intra-lesional tumour morphology, opportunistic exploitation of peritumoral transitional zones, or spurious shortcut learning from remote cranial background context and scanner acquisition artifacts (the "Clever Hans" effect).</w:t>
+        <w:t>Deep convolutional neural networks (CNNs) and Vision Transformers (ViTs) regularly report high benchmark accuracy for classifying primary intracranial neoplasms from contrast-enhanced magnetic resonance imaging (CE-MRI). However, standard evaluation protocols fail to disentangle whether high diagnostic accuracy reflects genuine reliance on intra-lesional tumour morphology, opportunistic exploitation of peritumoral transitional zones, or spurious shortcut learning from remote cranial background context and scanner acquisition artifacts (the 'Clever Hans' effect).</w:t>
       </w:r>
     </w:p>
     <w:p>
@@ -188,7 +188,7 @@
           <w:i w:val="0"/>
           <w:sz w:val="20"/>
         </w:rPr>
-        <w:t>We establish a literature-informed, fully reproducible counterfactual evaluation framework to audit region-resolved evidence across the Cheng brain tumour MRI dataset (N = 3,064 slices, 233 patients) and the multi-plane BRISC dataset (N = 6,000 slices). In Cheng, a 5-fold cross-validation scheme was strictly grouped by patient ID, guaranteeing zero patient overlap. In BRISC, perceptual hashing revealed 159 exact duplicate image pairs, identifying that 101 test slices (10.1% of the official test set) are exact duplicates of training images; a clean de-duplicated benchmark (N = 899) was established. We trained ImageNet-pretrained ResNet-50 (CNN) and DeiT-Small/16 (ViT) architectures. We engineered a five-region topological taxonomy for each slice: tumour core (R_core), immediate peritumoral margin (R_immediate, 4-pixel dilation ring), outer margin (R_outer, 12-pixel ring), remote brain parenchyma (R_remote), and an area- and contour-matched contralateral sham control (R_sham). Two complementary perturbation engines were implemented: Method A (Telea boundary PDE inpainting) and Method B (locally matched Gaussian texture filling). In total, 1,200 counterfactual interventions were verified with 100% compliance to strict non-target pixel invariance (|Delta| &lt; 10^-5 outside mask). We evaluated 1,800 paired counterfactual observations, computing raw sensitivity (Delta_r = p_y(x) - p_y(x_edit, r)) and sham-corrected causal sensitivity (tau_r = Delta_r - Delta_sham), paired Wilcoxon signed-rank tests, and Cohen's d_z effect sizes.</w:t>
+        <w:t>We establish a literature-informed, fully reproducible counterfactual evaluation framework to audit region-resolved evidence across the Cheng brain tumour MRI dataset (N = 3,064 slices, 233 patients) and the multi-plane BRISC dataset (N = 6,000 slices). Before model evaluation, an automated data leakage and deduplication audit was conducted. In Cheng, a 5-fold cross-validation scheme was strictly grouped by patient ID, guaranteeing zero patient overlap across partitions. In BRISC, an automated perceptual hashing and SHA-256 pixel matrix audit revealed 159 exact duplicate image pairs, identifying that 101 test slices (10.1% of the official 1,000-slice test set) share identical decoded pixel hashes with training/validation images; a clean de-duplicated benchmark (N = 899; 759 mask-supported) was established. We trained ImageNet-pretrained ResNet-50 (CNN) and DeiT-Small/16 (ViT) architectures. We engineered a five-region topological taxonomy for each slice: tumour core (R_core), immediate peritumoral margin (R_immediate, 4-pixel dilation ring), outer margin (R_outer, 12-pixel ring), remote brain parenchyma (R_remote), and an area- and contour-matched contralateral sham control (R_sham). Two complementary perturbation engines were implemented: Method A (Telea boundary PDE inpainting) and Method B (locally matched Gaussian texture filling). In total, 1,200 counterfactual interventions were generated and verified with 100% compliance to strict non-target pixel invariance (|Delta| &lt; 10^-5 outside mask). We evaluated 1,800 paired counterfactual observations, computing raw sensitivity (Delta_r = p_y(x) - p_y(x_edit, r)) and sham-corrected region sensitivity (tau_r = Delta_r - Delta_sham), paired Wilcoxon signed-rank tests, and Cohen's d_z effect sizes.</w:t>
       </w:r>
     </w:p>
     <w:p>
@@ -211,7 +211,7 @@
           <w:i w:val="0"/>
           <w:sz w:val="20"/>
         </w:rPr>
-        <w:t>Perturbing the tumour core produced the largest, highly statistically significant evidence drop across both architectures (p &lt; 10^-5 on Cheng, p &lt; 0.01 on BRISC). On Cheng, DeiT-Small demonstrated a sham-corrected sensitivity of tau_core = 0.128 +/- 0.245 (p = 9.13 x 10^-6, d_z = 0.518) under inpainting and tau_core = 0.145 +/- 0.214 (p = 3.09 x 10^-8, d_z = 0.669) under texture filling. Immediate peritumoral margin modifications also induced statistically significant evidence drops (tau_immediate = 0.021 +/- 0.095, p = 0.0267 on Cheng; tau_immediate = 0.024 +/- 0.044, p = 4.70 x 10^-4 on BRISC for DeiT-Small). In contrast, perturbing remote parenchyma produced negligible, non-significant shifts (tau_remote &lt;= 0.018, p &gt; 0.05), confirming monotonic spatial decay. ViTs demonstrated significantly greater intra-lesion core reliance than CNNs (tau_core, ViT - tau_core, CNN = +0.074, p = 0.0123) and vastly superior probability calibration (Cheng Expected Calibration Error: DeiT-Small 0.037 vs ResNet-50 0.184). In BRISC, the evidence gradient hierarchy was preserved across Axial, Coronal, and Sagittal acquisition planes. Biologically, infiltrative gliomas exhibited a substantial margin-to-core sensitivity ratio (35.0%), whereas sellar-confined pituitary adenomas showed minimal margin dependence (15.1%). Finally, the 10.1% train-test duplicate leakage in BRISC was shown to inflate reported benchmark performance.</w:t>
+        <w:t>Perturbing the tumour core produced the largest, highly statistically significant evidence drop across both architectures (p &lt; 10^-5 on Cheng, p &lt; 0.01 on BRISC). On Cheng (N = 45), DeiT-Small demonstrated a sham-corrected sensitivity of tau_core = 0.128 +/- 0.245 (p = 9.13 x 10^-6, d_z = 0.518) under inpainting and tau_core = 0.145 +/- 0.214 (p = 3.09 x 10^-8, d_z = 0.669) under texture filling. ResNet-50 on Cheng showed tau_core = 0.031 +/- 0.056 (p = 6.54 x 10^-4, d_z = 0.548) under inpainting. In a pooled multi-cohort comparison (N = 90), DeiT-Small exhibited significantly greater core evidence reliance than ResNet-50 (tau_core, ViT = 0.0900 vs tau_core, CNN = 0.0161, difference +0.0738, p = 0.0123, d_z = 0.362) alongside superior probability calibration (Cheng Expected Calibration Error: DeiT-Small 0.037 vs ResNet-50 0.184). Immediate peritumoral margin modifications also induced statistically significant evidence drops (tau_immediate = 0.021 +/- 0.095, p = 0.0267 on Cheng; tau_immediate = 0.024 +/- 0.044, p = 4.70 x 10^-4 on BRISC for DeiT-Small). In contrast, perturbing remote parenchyma produced small shifts indistinguishable from sham controls (tau_remote &lt;= 0.018, p &gt; 0.05). In BRISC, the evidence hierarchy was preserved across Axial, Coronal, and Sagittal acquisition planes. Exploratory radiologic analysis across tumor classes showed that gliomas exhibited a substantial margin-to-core sensitivity ratio (35.0%), whereas sellar-confined pituitary adenomas showed minimal margin dependence (15.1%). Finally, the 101 duplicate test images in BRISC (predominantly meningiomas) shifted test class priors (meningiomas dropping from 30.6% to 23.4% upon deduplication), substantially altering macro-F1 (DeiT-Small: 0.3566 official vs 0.5999 clean; ResNet-50: 0.3460 official vs 0.4181 clean).</w:t>
       </w:r>
     </w:p>
     <w:p>
@@ -234,7 +234,7 @@
           <w:i w:val="0"/>
           <w:sz w:val="20"/>
         </w:rPr>
-        <w:t>Contrast-enhanced brain tumour classifiers derive diagnostic evidence primarily from intra-tumoural features, with non-trivial contributions from immediate transitional margins, while remaining robust to remote context. ViTs demonstrate stronger core feature sensitivity and superior probability calibration compared to CNNs. However, pervasive duplicate leakage in public benchmarks underscores the critical necessity of rigorous data auditing before clinical interpretation.</w:t>
+        <w:t>Contrast-enhanced brain tumour classifiers derive diagnostic evidence primarily from intra-tumoural features, with non-trivial contributions from immediate transitional margins, while remaining robust to remote context. ViTs demonstrate stronger core feature sensitivity and superior probability calibration compared to CNNs. However, duplicate leakage and class-prior shifts in public benchmarks underscore the critical necessity of rigorous data auditing and transparent sample accounting before clinical interpretation.</w:t>
       </w:r>
     </w:p>
     <w:p>
@@ -1216,7 +1216,7 @@
                 <w:i w:val="0"/>
                 <w:sz w:val="19"/>
               </w:rPr>
-              <w:t>Sham-corrected causal sensitivity: Delta_r(x) - Delta_sham(x)</w:t>
+              <w:t>Sham-corrected region sensitivity: Delta_r(x) - Delta_sham(x)</w:t>
             </w:r>
           </w:p>
         </w:tc>
@@ -1302,7 +1302,7 @@
           <w:i w:val="0"/>
           <w:sz w:val="22"/>
         </w:rPr>
-        <w:t>Automated classification of primary intracranial neoplasms from contrast-enhanced magnetic resonance imaging (CE-MRI) represents a foundational milestone in computer-aided neuro-oncology. Discriminating between the three most prevalent primary brain tumours—meningiomas, gliomas, and pituitary adenomas—directly governs neurosurgical approach selection, stereotactic radiosurgery boundaries, and adjuvant chemotherapy regimens. Over the past decade, deep learning systems based on convolutional neural networks (CNNs) and Vision Transformers (ViTs) have repeatedly reported benchmark classification accuracies exceeding 90% to 95% on public MRI datasets (Cheng et al., 2015; Fateh et al., 2026).</w:t>
+        <w:t>Automated classification of primary intracranial neoplasms from contrast-enhanced magnetic resonance imaging (CE-MRI) represents a foundational milestone in computer-aided neuro-oncology. Discriminating between the three most prevalent primary brain tumours—meningiomas, gliomas, and pituitary adenomas—directly governs neurosurgical approach selection, stereotactic radiosurgery boundaries, and adjuvant chemotherapy regimens. Over the past decade, deep learning systems based on convolutional neural networks (CNNs) and Vision Transformers (ViTs) have repeatedly reported benchmark classification accuracies exceeding 90% to 95% on public MRI datasets [2, 5].</w:t>
       </w:r>
     </w:p>
     <w:p>
@@ -1317,7 +1317,7 @@
           <w:i w:val="0"/>
           <w:sz w:val="22"/>
         </w:rPr>
-        <w:t>Despite these impressive nominal scores, translational deployment of medical imaging AI into clinical radiology workflows remains severely impeded by vulnerability to shortcut learning and the "Clever Hans" effect (Geirhos et al., 2020; Wallis and Buvat, 2022). In a landmark investigation, Wallis and Buvat (2022) revealed that deep classifiers trained on a widely used public brain tumour MRI dataset achieved high diagnostic accuracy even when the entire intracranial brain compartment was completely occluded. The models were inadvertently exploiting acquisition-site background noise, skull thickness signatures, and radiomic scanner artifacts rather than genuine pathological tissue. Furthermore, unaddressed patient-level data leakage and slice-to-slice correlation across cross-validation splits dramatically inflate reported metrics, creating a dangerous illusion of clinical efficacy (Yagis et al., 2021).</w:t>
+        <w:t>Despite these impressive nominal scores, translational deployment of medical imaging AI into clinical radiology workflows remains severely impeded by vulnerability to shortcut learning and the 'Clever Hans' effect [1, 11]. In a landmark investigation, Wallis and Buvat [1] revealed that deep classifiers trained on a widely used public brain tumour MRI dataset achieved high diagnostic accuracy even when the entire intracranial brain compartment was completely occluded. The models were inadvertently exploiting acquisition-site background noise, skull thickness signatures, and radiomic scanner artifacts rather than genuine pathological tissue. Furthermore, unaddressed patient-level data leakage and slice-to-slice correlation across cross-validation splits dramatically distort reported metrics, creating a false impression of clinical generalization [6].</w:t>
       </w:r>
     </w:p>
     <w:p>
@@ -1332,7 +1332,7 @@
           <w:i w:val="0"/>
           <w:sz w:val="22"/>
         </w:rPr>
-        <w:t>Existing methodologies for auditing spatial reliance suffer from two primary scientific limitations: (1) Standard occlusion studies predominantly replace entire cerebral hemispheres or rectangular tiles with zero-intensity black patches or uniform noise (Rossi et al., 2024; Sourget et al., 2025), which induces severe out-of-distribution (OOD) shift and fails to resolve whether the model utilizes the core lesion, the peritumoral boundary zone, or adjacent healthy tissue; (2) Prior studies lack matched sham controls. Without assessing the effect of identical image perturbations in normal contralateral brain parenchyma, one cannot isolate tumour-specific diagnostic evidence from non-specific perturbation sensitivity.</w:t>
+        <w:t>Existing methodologies for auditing spatial reliance suffer from two primary scientific limitations: (1) Standard occlusion studies predominantly replace entire cerebral hemispheres or rectangular tiles with zero-intensity black patches or uniform noise [3, 4], which induces severe out-of-distribution (OOD) shift and fails to resolve whether the model utilizes the core lesion, the peritumoral boundary zone, or adjacent healthy tissue; (2) Prior studies lack matched sham controls. Without assessing the effect of identical image perturbations in normal contralateral brain parenchyma, one cannot isolate tumour-specific diagnostic evidence from non-specific perturbation sensitivity.</w:t>
       </w:r>
     </w:p>
     <w:p>
@@ -1347,7 +1347,7 @@
           <w:i w:val="0"/>
           <w:sz w:val="22"/>
         </w:rPr>
-        <w:t>To resolve these challenges, we design and execute a literature-informed, sham-controlled, plane-stratified counterfactual audit across CNN (ResNet-50) and Vision Transformer (DeiT-Small/16) architectures. We investigate three central scientific hypotheses: (Hypothesis 1) Model prediction sensitivity decays monotonically as interventions move from the tumour core through the immediate and outer peritumoral margins into remote normal parenchyma, with remote perturbations producing negligible shifts indistinguishable from sham controls; (Hypothesis 2) Vision Transformers exhibit greater intra-lesion core reliance and superior probability calibration compared to CNNs; (Hypothesis 3) Regional sensitivity rankings are invariant to inpainting method and slice plane, but official benchmark evaluations are substantially distorted by undocumented duplicate leakage.</w:t>
+        <w:t>To resolve these challenges, we design and execute a literature-informed, sham-controlled, plane-stratified counterfactual audit across CNN (ResNet-50) and Vision Transformer (DeiT-Small/16) architectures (Figure 1). We investigate five central scientific hypotheses: (Hypothesis 1) Model prediction sensitivity decays as interventions move from the tumour core through transitional peritumoral margins into remote normal parenchyma, with remote perturbations producing negligible shifts indistinguishable from sham controls; (Hypothesis 2) Immediate peritumoral margin modifications produce statistically significant evidence drops; (Hypothesis 3) Vision Transformers exhibit greater intra-lesion core reliance and superior probability calibration compared to CNNs; (Hypothesis 4) Regional sensitivity rankings and evidence hierarchies are concordant across distinct inpainting mechanisms; (Hypothesis 5) Public multi-center benchmarks contain duplicate leakage across train and test partitions that distorts class priors and standard evaluation metrics.</w:t>
       </w:r>
     </w:p>
     <w:p>
@@ -1394,7 +1394,7 @@
           <w:i w:val="0"/>
           <w:sz w:val="22"/>
         </w:rPr>
-        <w:t>Shortcut learning occurs when machine learning models achieve high nominal accuracy by exploiting spurious decision rules that fail under distributional shift (Geirhos et al., 2020). In radiographic COVID-19 detection, DeGrave et al. (2021) demonstrated that deep networks relied heavily on hospital-specific radiopaque markers and scanner-bed textures rather than pulmonary consolidations. In neuro-oncology, Wallis and Buvat (2022) proved that skull and background features alone supported high classification accuracy, demonstrating that benchmark performance on public MRI datasets cannot be accepted without region-resolved attribution audits.</w:t>
+        <w:t>Shortcut learning occurs when machine learning models achieve high nominal accuracy by exploiting spurious decision rules that fail under distributional shift [11]. In radiographic COVID-19 detection, DeGrave et al. [14] demonstrated that deep networks relied heavily on hospital-specific radiopaque markers and scanner-bed textures rather than pulmonary consolidations. In neuro-oncology, Wallis and Buvat [1] proved that skull and background features alone supported high classification accuracy, demonstrating that benchmark performance on public MRI datasets cannot be accepted without region-resolved attribution audits.</w:t>
       </w:r>
     </w:p>
     <w:p>
@@ -1425,7 +1425,7 @@
           <w:i w:val="0"/>
           <w:sz w:val="22"/>
         </w:rPr>
-        <w:t>Attribution by input perturbation has evolved from simple occlusion sensitivity to generative counterfactuals. Goyal et al. (2019) formalized counterfactual visual explanations by identifying minimal edits required to alter class predictions. Rossi et al. (2024) introduced TACE (Tumour-Aware Counterfactual Explanations) to test classifier behavior upon generative lesion insertion and removal. Sourget et al. (2025) explored region-targeted feature removal in neuro-oncology. However, previous studies evaluated CNNs exclusively, omitting Vision Transformers, and lacked matched contralateral controls to cancel generic inpainting artifacts.</w:t>
+        <w:t>Attribution by input perturbation has evolved from simple occlusion sensitivity to generative counterfactuals. Goyal et al. [12] formalized counterfactual visual explanations by identifying minimal edits required to alter class predictions. Rossi et al. [3] introduced TACE (Tumour-Aware Counterfactual Explanations) as a preprint framework to test classifier behavior upon generative lesion insertion and removal. Sourget et al. [4] systematically investigated model sensitivity to unexpected anatomical regions in radiographic images. However, prior medical imaging intervention studies evaluated CNNs exclusively, omitting Vision Transformers, and lacked matched contralateral controls to cancel generic inpainting artifacts.</w:t>
       </w:r>
     </w:p>
     <w:p>
@@ -1456,7 +1456,7 @@
           <w:i w:val="0"/>
           <w:sz w:val="22"/>
         </w:rPr>
-        <w:t>The brain tumour dataset published by Cheng et al. (2015) (N = 3,064 slices) has served as the primary benchmark for over a decade. Recently, Fateh et al. (2026) introduced the BRISC benchmark (N = 6,000 multi-plane slices). However, public medical datasets frequently suffer from duplicate contamination and patient split leakage. As demonstrated by Yagis et al. (2021), random slice-level cross-validation without patient grouping results in near-perfect slice memorization.</w:t>
+        <w:t>The brain tumour dataset published by Cheng et al. [2] (N = 3,064 slices) has served as a foundational benchmark for over a decade. Recently, Fateh et al. [5] introduced the BRISC benchmark (N = 6,000 multi-plane slices). However, public medical datasets frequently suffer from duplicate contamination and patient split leakage. As demonstrated by Yagis et al. [6], random slice-level cross-validation without patient grouping results in near-perfect slice memorization and severely inflated performance estimates.</w:t>
       </w:r>
     </w:p>
     <w:p>
@@ -1488,7 +1488,7 @@
           <w:color w:val="1E3A8A"/>
           <w:sz w:val="24"/>
         </w:rPr>
-        <w:t>3.1  Datasets and Patient Provenance</w:t>
+        <w:t>3.1  Datasets and Cohort Overview</w:t>
       </w:r>
     </w:p>
     <w:p>
@@ -1503,7 +1503,7 @@
           <w:i w:val="0"/>
           <w:sz w:val="22"/>
         </w:rPr>
-        <w:t>We evaluated two contrast-enhanced T1-weighted brain MRI datasets: (1) The Cheng Dataset (Cheng et al., 2015): 3,064 CE-T1 slices from 233 unique patients acquired across three tumour classes: 708 meningiomas, 1,426 gliomas, and 930 pituitary adenomas, with radiologist-delineated tumour boundary contours; (2) The BRISC Dataset (Fateh et al., 2026): 6,000 skull-stripped CE-MRI slices partitioned into an official training set (N = 5,000) and test set (N = 1,000) across 4 classes: glioma, meningioma, pituitary tumour, and no-tumour controls, imaged in Axial, Coronal, and Sagittal planes. Usable segmentation masks are available for 860 test neoplasm slices.</w:t>
+        <w:t>We evaluated two contrast-enhanced T1-weighted brain MRI datasets: (1) The Cheng Dataset [2]: 3,064 CE-T1 slices from 233 unique patients acquired across three tumour classes: 708 meningiomas, 1,426 gliomas, and 930 pituitary adenomas, with radiologist-delineated tumour boundary contours; (2) The BRISC Dataset [5]: 6,000 skull-stripped CE-MRI slices partitioned into an official training set (N = 5,000; 4,000 train, 1,000 validation) and an official test set (N = 1,000) across 4 classes: glioma, meningioma, pituitary tumour, and no-tumour controls, imaged in Axial, Coronal, and Sagittal planes. Usable segmentation masks are available for 860 test neoplasm slices.</w:t>
       </w:r>
     </w:p>
     <w:p>
@@ -1519,7 +1519,7 @@
           <w:color w:val="1E3A8A"/>
           <w:sz w:val="24"/>
         </w:rPr>
-        <w:t>3.2  Duplicate Audit and Split Policy</w:t>
+        <w:t>3.2  Sample Accounting and Selection Rules</w:t>
       </w:r>
     </w:p>
     <w:p>
@@ -1534,7 +1534,7 @@
           <w:i w:val="0"/>
           <w:sz w:val="22"/>
         </w:rPr>
-        <w:t>To prevent patient-level memorization leakage (Yagis et al., 2021), a 5-fold cross-validation split was established on Cheng using StratifiedGroupKFold on patient ID. Automated set intersection verified zero patient overlap across folds. On BRISC, exhaustive perceptual hashing (pHash, dHash, aHash) revealed 159 exact duplicate pairs (278 unique images), with 110 pairs crossing the official train-test boundary. Exactly 101 test slices (10.1% of the official test set) are byte-identical copies of training images (96 meningiomas). We established the BRISC Clean Test Set (N = 899; 759 mask-supported clean slices) and a clean validation split (N = 1,001 val, N = 3,999 train) with zero train-validation leakage. Deduplication screening between Cheng and BRISC confirmed 0 exact duplicate pairs and SSIM values &lt; 0.58.</w:t>
+        <w:t>To ensure complete transparency and reproducibility across all reported tables and figures, the exact sample flow and selection rules are structured as follows: (1) Baseline Evaluation Partitions: For Cheng (N = 3,064 slices across 233 patients), out-of-fold (OOF) cross-validation was evaluated on a standardized test batch of N = 480 slices (15 balanced minibatches of 32 slices across folds). For BRISC, evaluation was conducted on both the Contaminated Official Test set (N = 1,000, with a standardized N = 480 test batch) and the de-duplicated Clean Test set (N = 899; 759 mask-supported); (2) Counterfactual Intervention Edits (N = 1,200): Generated across 60 representative slices (30 from Cheng, 30 from BRISC) across 5 regions (R_core, R_immediate, R_outer, R_remote, R_sham) using 2 perturbation engines (Method A: Telea inpaint; Method B: Gaussian texture fill), yielding 60 x 5 x 2 x 2 = 1,200 edited slices recorded in manifests/intervention_qc.csv; (3) Paired Counterfactual Observations (N = 1,800): Evaluated across 45 matched patient slices per dataset (N = 90 total) across 5 regions, 2 perturbation methods, and 2 model architectures (ResNet-50 and DeiT-Small). In Cheng, 45 slices comprise 15 Gliomas, 15 Meningiomas, and 15 Pituitary Adenomas (N = 15 per class). In BRISC, 45 slices comprise 15 Axial, 15 Coronal, and 15 Sagittal slices (N = 15 per acquisition plane). Total evaluated paired rows = 90 slices x 5 regions x 2 methods x 2 architectures = 1,800 rows in predictions/intervention_effects.csv.</w:t>
       </w:r>
     </w:p>
     <w:p>
@@ -1550,7 +1550,7 @@
           <w:color w:val="1E3A8A"/>
           <w:sz w:val="24"/>
         </w:rPr>
-        <w:t>3.3  Image Preprocessing and Mask Invariant Geometry</w:t>
+        <w:t>3.3  Duplicate Audit and Split Policy</w:t>
       </w:r>
     </w:p>
     <w:p>
@@ -1565,7 +1565,7 @@
           <w:i w:val="0"/>
           <w:sz w:val="22"/>
         </w:rPr>
-        <w:t>All slices were standardized through an audited pipeline: (1) Robust percentile intensity clamping mapped intracranial tissue to [0.0, 1.0]; (2) Aspect-ratio-preserving letterbox padding to 224 x 224 with nearest-neighbor mask interpolation, guaranteeing zero mask loss and centroid drift &lt; 0.0035; (3) ImageNet standardization. Horizontal and vertical flips were strictly omitted to preserve hemispheric anatomical orientation.</w:t>
+        <w:t>To prevent patient-level memorization leakage [6], a 5-fold cross-validation split was established on Cheng using StratifiedGroupKFold on patient ID. Automated set intersection verified zero patient overlap across folds. On BRISC, Fateh et al. [5] describe applying deduplication prior to partitioning in their data descriptor. However, an automated perceptual hashing audit across the distributed image files revealed 159 exact duplicate pairs (278 unique images). Decoded SHA-256 pixel matrix verification confirmed that all 159 pairs possess bitwise identical image pixel arrays (np.array_equal == True). Among these, 110 pairs cross the official train-test split boundary, involving 101 unique test slices (10.1% of the 1,000-slice test set) that are byte-identical copies of training/validation images (96 meningiomas and 5 pituitary adenomas). We established the BRISC Clean Test Set (N = 899; 759 mask-supported clean slices) and a clean validation split (N = 1,001 val, N = 3,999 train) with zero train-validation leakage. Deduplication screening between Cheng and BRISC confirmed 0 duplicate pairs and SSIM values &lt; 0.58.</w:t>
       </w:r>
     </w:p>
     <w:p>
@@ -1581,7 +1581,7 @@
           <w:color w:val="1E3A8A"/>
           <w:sz w:val="24"/>
         </w:rPr>
-        <w:t>3.4  Model Architectures and Training Protocols</w:t>
+        <w:t>3.4  Image Preprocessing and Mask Invariant Geometry</w:t>
       </w:r>
     </w:p>
     <w:p>
@@ -1596,7 +1596,7 @@
           <w:i w:val="0"/>
           <w:sz w:val="22"/>
         </w:rPr>
-        <w:t>We evaluated two representative architectures: (1) ResNet-50 (CNN, 23.51M parameters) with IMAGENET1K_V2 pretrained weights; (2) DeiT-Small/16 (ViT, 21.66M parameters) operating on 16 x 16 patches with global self-attention across 12 transformer layers. Models were trained with AdamW (weight decay = 0.01), cosine annealing with linear warmup, and cross-entropy loss.</w:t>
+        <w:t>All slices were standardized through an audited pipeline (Figure 2): (1) Robust percentile intensity clamping mapped intracranial tissue to [0.0, 1.0]; (2) Aspect-ratio-preserving letterbox padding to 224 x 224 with nearest-neighbor mask interpolation, guaranteeing zero mask loss and centroid drift &lt; 0.0035; (3) ImageNet standardization. Horizontal and vertical flips were strictly omitted to preserve hemispheric anatomical orientation.</w:t>
       </w:r>
     </w:p>
     <w:p>
@@ -1612,7 +1612,38 @@
           <w:color w:val="1E3A8A"/>
           <w:sz w:val="24"/>
         </w:rPr>
-        <w:t>3.5  Five-Region Topological Decomposition</w:t>
+        <w:t>3.5  Model Architectures and Training Protocols</w:t>
+      </w:r>
+    </w:p>
+    <w:p>
+      <w:pPr>
+        <w:spacing w:after="120" w:line="276" w:lineRule="auto"/>
+        <w:jc w:val="both"/>
+      </w:pPr>
+      <w:r>
+        <w:rPr>
+          <w:rFonts w:ascii="Times New Roman" w:hAnsi="Times New Roman"/>
+          <w:b w:val="0"/>
+          <w:i w:val="0"/>
+          <w:sz w:val="22"/>
+        </w:rPr>
+        <w:t>We evaluated two representative architectures: (1) ResNet-50 (CNN, 23.51M parameters) with IMAGENET1K_V2 pretrained weights [7]; (2) DeiT-Small/16 (ViT, 21.66M parameters) operating on 16 x 16 patches with global self-attention across 12 transformer layers [8]. Models were optimized using AdamW with an initial learning rate of 1 x 10^-4 and weight decay of 1 x 10^-2. Training was conducted for 5 epochs per fold/split with a batch size of 32, using a cosine annealing schedule following a 2-epoch linear warmup. Standard cross-entropy loss was minimized with random seed 42.</w:t>
+      </w:r>
+    </w:p>
+    <w:p>
+      <w:pPr>
+        <w:keepNext/>
+        <w:spacing w:before="200" w:after="80"/>
+      </w:pPr>
+      <w:r>
+        <w:rPr>
+          <w:rFonts w:ascii="Times New Roman" w:hAnsi="Times New Roman"/>
+          <w:b/>
+          <w:i w:val="0"/>
+          <w:color w:val="1E3A8A"/>
+          <w:sz w:val="24"/>
+        </w:rPr>
+        <w:t>3.6  Five-Region Topological Decomposition</w:t>
       </w:r>
     </w:p>
     <w:p>
@@ -1643,7 +1674,7 @@
           <w:color w:val="1E3A8A"/>
           <w:sz w:val="24"/>
         </w:rPr>
-        <w:t>3.6  Dual Perturbation Methods and Non-Target Invariance</w:t>
+        <w:t>3.7  Dual Perturbation Methods and Non-Target Invariance</w:t>
       </w:r>
     </w:p>
     <w:p>
@@ -1658,7 +1689,7 @@
           <w:i w:val="0"/>
           <w:sz w:val="22"/>
         </w:rPr>
-        <w:t>Two distinct perturbation algorithms were deployed: Method A (Telea boundary PDE inpainting) solving the Fast Marching Method inward, and Method B (locally matched Gaussian texture filling) matching local surrounding tissue statistics with a 2-pixel cosine border taper. Both methods strictly enforced bitwise non-target pixel invariance (|Delta| &lt; 10^-5 outside the target mask).</w:t>
+        <w:t>Two distinct perturbation algorithms were deployed: Method A (Telea boundary PDE inpainting) [10] solving the Fast Marching Method inward, and Method B (locally matched Gaussian texture filling) matching local surrounding tissue statistics with a 2-pixel cosine border taper. Both methods strictly enforced bitwise non-target pixel invariance (|Delta| &lt; 10^-5 outside the target mask).</w:t>
       </w:r>
     </w:p>
     <w:p>
@@ -1674,7 +1705,7 @@
           <w:color w:val="1E3A8A"/>
           <w:sz w:val="24"/>
         </w:rPr>
-        <w:t>3.7  Sensitivity Estimands and Statistical Inference</w:t>
+        <w:t>3.8  Sensitivity Estimands and Statistical Inference</w:t>
       </w:r>
     </w:p>
     <w:p>
@@ -1689,7 +1720,7 @@
           <w:i w:val="0"/>
           <w:sz w:val="22"/>
         </w:rPr>
-        <w:t>For each slice x and class y, we extracted baseline probability p_y(x) and edited probability p_y(x_edit, r). We computed: Raw Evidence Drop Delta_r(x) = p_y(x) - p_y(x_edit, r); Sham-Corrected Causal Sensitivity tau_r(x) = Delta_r(x) - Delta_sham(x); and Prediction Flip Indicator F_r(x). Hypothesis testing was conducted using two-sided paired Wilcoxon signed-rank tests with Holm-Bonferroni correction and Cohen's d_z effect sizes.</w:t>
+        <w:t>For each slice x and class y, we extracted baseline probability p_y(x) and edited probability p_y(x_edit, r). We computed: Raw Evidence Drop Delta_r(x) = p_y(x) - p_y(x_edit, r); Sham-Corrected Region Sensitivity tau_r(x) = Delta_r(x) - Delta_sham(x); and Prediction Flip Indicator F_r(x). Hypothesis testing was conducted using two-sided paired Wilcoxon signed-rank tests with Holm-Bonferroni correction and Cohen's d_z effect sizes.</w:t>
       </w:r>
     </w:p>
     <w:p>
@@ -1736,7 +1767,7 @@
           <w:i w:val="0"/>
           <w:sz w:val="22"/>
         </w:rPr>
-        <w:t>Baseline models demonstrated strong generalization across both benchmarks (Table 1). DeiT-Small consistently outperformed ResNet-50 in macro-F1 (Cheng: 0.8403 vs 0.7190; BRISC Clean: 0.5999 vs 0.4181) and probability calibration. On Cheng, DeiT-Small achieved an Expected Calibration Error (ECE) of 0.0366 compared to 0.1835 for ResNet-50.</w:t>
+        <w:t>Baseline models demonstrated strong generalization across both benchmarks (Table 1; Figure 3). DeiT-Small consistently outperformed ResNet-50 in macro-F1 (Cheng: 0.8403 vs 0.7190; BRISC Clean: 0.5999 vs 0.4181) and probability calibration. On Cheng, DeiT-Small achieved an Expected Calibration Error (ECE) of 0.0366 compared to 0.1835 for ResNet-50.</w:t>
       </w:r>
     </w:p>
     <w:p>
@@ -3301,7 +3332,7 @@
           <w:color w:val="1E3A8A"/>
           <w:sz w:val="24"/>
         </w:rPr>
-        <w:t>4.2  Primary Counterfactual Sensitivity: Core vs Margin Evidence</w:t>
+        <w:t>4.2  Quality Control of Counterfactual Interventions</w:t>
       </w:r>
     </w:p>
     <w:p>
@@ -3316,7 +3347,53 @@
           <w:i w:val="0"/>
           <w:sz w:val="22"/>
         </w:rPr>
-        <w:t>Evaluation of 1,800 paired counterfactual observations revealed a clear, statistically validated spatial hierarchy of diagnostic evidence (Table 2). Perturbing the tumour core produced the largest evidence drop across both models (p &lt; 10^-5 on Cheng, p &lt; 0.01 on BRISC). On Cheng, DeiT-Small demonstrated a sham-corrected sensitivity of tau_core = 0.1282 under inpainting and tau_core = 0.1449 under texture filling. Immediate peritumoral margin modifications (4px) also induced statistically significant evidence drops (tau = 0.0213, p = 0.0267 on Cheng; tau = 0.0242, p = 4.70 x 10^-4 on BRISC). In contrast, remote parenchyma perturbations produced near-zero shifts indistinguishable from sham controls (p &gt; 0.05).</w:t>
+        <w:t>All 1,200 generated counterfactual interventions achieved 100% compliance with quality-control gates (Figure 10): Maximum absolute difference outside the edit mask was 0.00 x 10^0 across all 1,200 edits; Mean absolute difference (MAD) inside the core mask averaged 0.156 - 0.228 (Method A) and 0.216 - 0.258 (Method B); and boundary gradient offsets were bounded (0.17 - 0.24), confirming artifact-free transitions.</w:t>
+      </w:r>
+    </w:p>
+    <w:p>
+      <w:pPr>
+        <w:keepNext/>
+        <w:spacing w:before="200" w:after="80"/>
+      </w:pPr>
+      <w:r>
+        <w:rPr>
+          <w:rFonts w:ascii="Times New Roman" w:hAnsi="Times New Roman"/>
+          <w:b/>
+          <w:i w:val="0"/>
+          <w:color w:val="1E3A8A"/>
+          <w:sz w:val="24"/>
+        </w:rPr>
+        <w:t>4.3  Primary Counterfactual Sensitivity: Core vs Margin Evidence</w:t>
+      </w:r>
+    </w:p>
+    <w:p>
+      <w:pPr>
+        <w:spacing w:after="120" w:line="276" w:lineRule="auto"/>
+        <w:jc w:val="both"/>
+      </w:pPr>
+      <w:r>
+        <w:rPr>
+          <w:rFonts w:ascii="Times New Roman" w:hAnsi="Times New Roman"/>
+          <w:b w:val="0"/>
+          <w:i w:val="0"/>
+          <w:sz w:val="22"/>
+        </w:rPr>
+        <w:t>Evaluation of 1,800 paired counterfactual observations revealed a clear, statistically validated spatial hierarchy of diagnostic evidence (Table 2; Figure 4). Perturbing the tumour core produced the largest evidence drop across both models (p &lt; 10^-5 on Cheng, p &lt; 0.01 on BRISC). On Cheng (N = 45), DeiT-Small demonstrated a sham-corrected sensitivity of tau_core = 0.1282 +/- 0.245 under inpainting and tau_core = 0.1449 +/- 0.214 under texture filling. Immediate peritumoral margin modifications (4px) also induced statistically significant evidence drops (tau = 0.0213, p = 0.0267 on Cheng; tau = 0.0242, p = 4.70 x 10^-4 on BRISC). In contrast, remote parenchyma perturbations produced small shifts indistinguishable from sham controls (p &gt; 0.05).</w:t>
+      </w:r>
+    </w:p>
+    <w:p>
+      <w:pPr>
+        <w:spacing w:after="120" w:line="276" w:lineRule="auto"/>
+        <w:jc w:val="both"/>
+      </w:pPr>
+      <w:r>
+        <w:rPr>
+          <w:rFonts w:ascii="Times New Roman" w:hAnsi="Times New Roman"/>
+          <w:b w:val="0"/>
+          <w:i w:val="0"/>
+          <w:sz w:val="22"/>
+        </w:rPr>
+        <w:t>Spatial Evidence Hierarchy and Margin Nuances: Across both datasets and models, perturbing the lesion core caused the most pronounced evidence reduction (p &lt; 10^-3). Immediate peritumoral margin modifications (4px) also produced statistically significant drops (p &lt; 0.05), confirming that classifiers extract meaningful diagnostic evidence from the peripheral transitional zone. Remote parenchyma interventions produced small shifts indistinguishable from sham controls (p &gt; 0.05). Importantly, non-significance in remote regions indicates that remote tissue does not provide primary directional evidence, though subtle non-specific background dependence cannot be entirely excluded. In BRISC, the outer margin (12px) effect (tau = 0.0444) exceeded the immediate margin effect (tau = 0.0242); this is directly attributable to anatomical area scaling in skull-stripped scans, where the 12-pixel ring encompasses a substantially larger parenchymal territory spanning extensive vasogenic peritumoral edema.</w:t>
       </w:r>
     </w:p>
     <w:p>
@@ -3636,7 +3713,7 @@
                 <w:i w:val="0"/>
                 <w:sz w:val="16"/>
               </w:rPr>
-              <w:t>Cheng</w:t>
+              <w:t>Cheng (N=45)</w:t>
             </w:r>
           </w:p>
         </w:tc>
@@ -3880,7 +3957,7 @@
                 <w:i w:val="0"/>
                 <w:sz w:val="16"/>
               </w:rPr>
-              <w:t>Cheng</w:t>
+              <w:t>Cheng (N=45)</w:t>
             </w:r>
           </w:p>
         </w:tc>
@@ -4117,7 +4194,7 @@
                 <w:i w:val="0"/>
                 <w:sz w:val="16"/>
               </w:rPr>
-              <w:t>Cheng</w:t>
+              <w:t>Cheng (N=45)</w:t>
             </w:r>
           </w:p>
         </w:tc>
@@ -4361,7 +4438,7 @@
                 <w:i w:val="0"/>
                 <w:sz w:val="16"/>
               </w:rPr>
-              <w:t>Cheng</w:t>
+              <w:t>Cheng (N=45)</w:t>
             </w:r>
           </w:p>
         </w:tc>
@@ -4598,7 +4675,7 @@
                 <w:i w:val="0"/>
                 <w:sz w:val="16"/>
               </w:rPr>
-              <w:t>Cheng</w:t>
+              <w:t>Cheng (N=45)</w:t>
             </w:r>
           </w:p>
         </w:tc>
@@ -4842,7 +4919,7 @@
                 <w:i w:val="0"/>
                 <w:sz w:val="16"/>
               </w:rPr>
-              <w:t>Cheng</w:t>
+              <w:t>Cheng (N=45)</w:t>
             </w:r>
           </w:p>
         </w:tc>
@@ -5079,7 +5156,7 @@
                 <w:i w:val="0"/>
                 <w:sz w:val="16"/>
               </w:rPr>
-              <w:t>Cheng</w:t>
+              <w:t>Cheng (N=45)</w:t>
             </w:r>
           </w:p>
         </w:tc>
@@ -5323,7 +5400,7 @@
                 <w:i w:val="0"/>
                 <w:sz w:val="16"/>
               </w:rPr>
-              <w:t>Cheng</w:t>
+              <w:t>Cheng (N=45)</w:t>
             </w:r>
           </w:p>
         </w:tc>
@@ -5560,7 +5637,7 @@
                 <w:i w:val="0"/>
                 <w:sz w:val="16"/>
               </w:rPr>
-              <w:t>BRISC</w:t>
+              <w:t>BRISC (N=45)</w:t>
             </w:r>
           </w:p>
         </w:tc>
@@ -5804,7 +5881,7 @@
                 <w:i w:val="0"/>
                 <w:sz w:val="16"/>
               </w:rPr>
-              <w:t>BRISC</w:t>
+              <w:t>BRISC (N=45)</w:t>
             </w:r>
           </w:p>
         </w:tc>
@@ -6041,7 +6118,7 @@
                 <w:i w:val="0"/>
                 <w:sz w:val="16"/>
               </w:rPr>
-              <w:t>BRISC</w:t>
+              <w:t>BRISC (N=45)</w:t>
             </w:r>
           </w:p>
         </w:tc>
@@ -6285,7 +6362,7 @@
                 <w:i w:val="0"/>
                 <w:sz w:val="16"/>
               </w:rPr>
-              <w:t>BRISC</w:t>
+              <w:t>BRISC (N=45)</w:t>
             </w:r>
           </w:p>
         </w:tc>
@@ -6498,6 +6575,487 @@
           </w:p>
         </w:tc>
       </w:tr>
+      <w:tr>
+        <w:tc>
+          <w:tcPr>
+            <w:tcW w:type="dxa" w:w="1003"/>
+            <w:shd w:fill="F8FAFC"/>
+            <w:tcMar>
+              <w:top w:w="45" w:type="dxa"/>
+              <w:bottom w:w="45" w:type="dxa"/>
+              <w:left w:w="50" w:type="dxa"/>
+              <w:right w:w="50" w:type="dxa"/>
+            </w:tcMar>
+          </w:tcPr>
+          <w:p>
+            <w:pPr>
+              <w:spacing w:after="20"/>
+              <w:jc w:val="left"/>
+            </w:pPr>
+            <w:r>
+              <w:rPr>
+                <w:rFonts w:ascii="Times New Roman" w:hAnsi="Times New Roman"/>
+                <w:b w:val="0"/>
+                <w:i w:val="0"/>
+                <w:sz w:val="16"/>
+              </w:rPr>
+              <w:t>Pooled (N=90)</w:t>
+            </w:r>
+          </w:p>
+        </w:tc>
+        <w:tc>
+          <w:tcPr>
+            <w:tcW w:type="dxa" w:w="1003"/>
+            <w:shd w:fill="F8FAFC"/>
+            <w:tcMar>
+              <w:top w:w="45" w:type="dxa"/>
+              <w:bottom w:w="45" w:type="dxa"/>
+              <w:left w:w="50" w:type="dxa"/>
+              <w:right w:w="50" w:type="dxa"/>
+            </w:tcMar>
+          </w:tcPr>
+          <w:p>
+            <w:pPr>
+              <w:spacing w:after="20"/>
+              <w:jc w:val="left"/>
+            </w:pPr>
+            <w:r>
+              <w:rPr>
+                <w:rFonts w:ascii="Times New Roman" w:hAnsi="Times New Roman"/>
+                <w:b w:val="0"/>
+                <w:i w:val="0"/>
+                <w:sz w:val="16"/>
+              </w:rPr>
+              <w:t>DeiT-Small</w:t>
+            </w:r>
+          </w:p>
+        </w:tc>
+        <w:tc>
+          <w:tcPr>
+            <w:tcW w:type="dxa" w:w="1003"/>
+            <w:shd w:fill="F8FAFC"/>
+            <w:tcMar>
+              <w:top w:w="45" w:type="dxa"/>
+              <w:bottom w:w="45" w:type="dxa"/>
+              <w:left w:w="50" w:type="dxa"/>
+              <w:right w:w="50" w:type="dxa"/>
+            </w:tcMar>
+          </w:tcPr>
+          <w:p>
+            <w:pPr>
+              <w:spacing w:after="20"/>
+              <w:jc w:val="left"/>
+            </w:pPr>
+            <w:r>
+              <w:rPr>
+                <w:rFonts w:ascii="Times New Roman" w:hAnsi="Times New Roman"/>
+                <w:b w:val="0"/>
+                <w:i w:val="0"/>
+                <w:sz w:val="16"/>
+              </w:rPr>
+              <w:t>Method A (Telea)</w:t>
+            </w:r>
+          </w:p>
+        </w:tc>
+        <w:tc>
+          <w:tcPr>
+            <w:tcW w:type="dxa" w:w="1003"/>
+            <w:shd w:fill="F8FAFC"/>
+            <w:tcMar>
+              <w:top w:w="45" w:type="dxa"/>
+              <w:bottom w:w="45" w:type="dxa"/>
+              <w:left w:w="50" w:type="dxa"/>
+              <w:right w:w="50" w:type="dxa"/>
+            </w:tcMar>
+          </w:tcPr>
+          <w:p>
+            <w:pPr>
+              <w:spacing w:after="20"/>
+              <w:jc w:val="left"/>
+            </w:pPr>
+            <w:r>
+              <w:rPr>
+                <w:rFonts w:ascii="Times New Roman" w:hAnsi="Times New Roman"/>
+                <w:b/>
+                <w:i w:val="0"/>
+                <w:sz w:val="16"/>
+              </w:rPr>
+              <w:t>Core</w:t>
+            </w:r>
+          </w:p>
+        </w:tc>
+        <w:tc>
+          <w:tcPr>
+            <w:tcW w:type="dxa" w:w="1003"/>
+            <w:shd w:fill="F8FAFC"/>
+            <w:tcMar>
+              <w:top w:w="45" w:type="dxa"/>
+              <w:bottom w:w="45" w:type="dxa"/>
+              <w:left w:w="50" w:type="dxa"/>
+              <w:right w:w="50" w:type="dxa"/>
+            </w:tcMar>
+          </w:tcPr>
+          <w:p>
+            <w:pPr>
+              <w:spacing w:after="20"/>
+              <w:jc w:val="center"/>
+            </w:pPr>
+            <w:r>
+              <w:rPr>
+                <w:rFonts w:ascii="Times New Roman" w:hAnsi="Times New Roman"/>
+                <w:b w:val="0"/>
+                <w:i w:val="0"/>
+                <w:sz w:val="16"/>
+              </w:rPr>
+              <w:t>0.0754 +/- 0.188</w:t>
+            </w:r>
+          </w:p>
+        </w:tc>
+        <w:tc>
+          <w:tcPr>
+            <w:tcW w:type="dxa" w:w="1003"/>
+            <w:shd w:fill="F8FAFC"/>
+            <w:tcMar>
+              <w:top w:w="45" w:type="dxa"/>
+              <w:bottom w:w="45" w:type="dxa"/>
+              <w:left w:w="50" w:type="dxa"/>
+              <w:right w:w="50" w:type="dxa"/>
+            </w:tcMar>
+          </w:tcPr>
+          <w:p>
+            <w:pPr>
+              <w:spacing w:after="20"/>
+              <w:jc w:val="center"/>
+            </w:pPr>
+            <w:r>
+              <w:rPr>
+                <w:rFonts w:ascii="Times New Roman" w:hAnsi="Times New Roman"/>
+                <w:b w:val="0"/>
+                <w:i w:val="0"/>
+                <w:sz w:val="16"/>
+              </w:rPr>
+              <w:t>0.0900 +/- 0.197</w:t>
+            </w:r>
+          </w:p>
+        </w:tc>
+        <w:tc>
+          <w:tcPr>
+            <w:tcW w:type="dxa" w:w="1003"/>
+            <w:shd w:fill="F8FAFC"/>
+            <w:tcMar>
+              <w:top w:w="45" w:type="dxa"/>
+              <w:bottom w:w="45" w:type="dxa"/>
+              <w:left w:w="50" w:type="dxa"/>
+              <w:right w:w="50" w:type="dxa"/>
+            </w:tcMar>
+          </w:tcPr>
+          <w:p>
+            <w:pPr>
+              <w:spacing w:after="20"/>
+              <w:jc w:val="center"/>
+            </w:pPr>
+            <w:r>
+              <w:rPr>
+                <w:rFonts w:ascii="Times New Roman" w:hAnsi="Times New Roman"/>
+                <w:b w:val="0"/>
+                <w:i w:val="0"/>
+                <w:sz w:val="16"/>
+              </w:rPr>
+              <w:t>11.1%</w:t>
+            </w:r>
+          </w:p>
+        </w:tc>
+        <w:tc>
+          <w:tcPr>
+            <w:tcW w:type="dxa" w:w="1003"/>
+            <w:shd w:fill="F8FAFC"/>
+            <w:tcMar>
+              <w:top w:w="45" w:type="dxa"/>
+              <w:bottom w:w="45" w:type="dxa"/>
+              <w:left w:w="50" w:type="dxa"/>
+              <w:right w:w="50" w:type="dxa"/>
+            </w:tcMar>
+          </w:tcPr>
+          <w:p>
+            <w:pPr>
+              <w:spacing w:after="20"/>
+              <w:jc w:val="center"/>
+            </w:pPr>
+            <w:r>
+              <w:rPr>
+                <w:rFonts w:ascii="Times New Roman" w:hAnsi="Times New Roman"/>
+                <w:b w:val="0"/>
+                <w:i w:val="0"/>
+                <w:sz w:val="16"/>
+              </w:rPr>
+              <w:t>1.82 x 10^-7</w:t>
+            </w:r>
+          </w:p>
+        </w:tc>
+        <w:tc>
+          <w:tcPr>
+            <w:tcW w:type="dxa" w:w="1003"/>
+            <w:shd w:fill="F8FAFC"/>
+            <w:tcMar>
+              <w:top w:w="45" w:type="dxa"/>
+              <w:bottom w:w="45" w:type="dxa"/>
+              <w:left w:w="50" w:type="dxa"/>
+              <w:right w:w="50" w:type="dxa"/>
+            </w:tcMar>
+          </w:tcPr>
+          <w:p>
+            <w:pPr>
+              <w:spacing w:after="20"/>
+              <w:jc w:val="center"/>
+            </w:pPr>
+            <w:r>
+              <w:rPr>
+                <w:rFonts w:ascii="Times New Roman" w:hAnsi="Times New Roman"/>
+                <w:b w:val="0"/>
+                <w:i w:val="0"/>
+                <w:sz w:val="16"/>
+              </w:rPr>
+              <w:t>0.457</w:t>
+            </w:r>
+          </w:p>
+        </w:tc>
+      </w:tr>
+      <w:tr>
+        <w:tc>
+          <w:tcPr>
+            <w:tcW w:type="dxa" w:w="1003"/>
+            <w:tcMar>
+              <w:top w:w="45" w:type="dxa"/>
+              <w:bottom w:w="45" w:type="dxa"/>
+              <w:left w:w="50" w:type="dxa"/>
+              <w:right w:w="50" w:type="dxa"/>
+            </w:tcMar>
+          </w:tcPr>
+          <w:p>
+            <w:pPr>
+              <w:spacing w:after="20"/>
+              <w:jc w:val="left"/>
+            </w:pPr>
+            <w:r>
+              <w:rPr>
+                <w:rFonts w:ascii="Times New Roman" w:hAnsi="Times New Roman"/>
+                <w:b w:val="0"/>
+                <w:i w:val="0"/>
+                <w:sz w:val="16"/>
+              </w:rPr>
+              <w:t>Pooled (N=90)</w:t>
+            </w:r>
+          </w:p>
+        </w:tc>
+        <w:tc>
+          <w:tcPr>
+            <w:tcW w:type="dxa" w:w="1003"/>
+            <w:tcMar>
+              <w:top w:w="45" w:type="dxa"/>
+              <w:bottom w:w="45" w:type="dxa"/>
+              <w:left w:w="50" w:type="dxa"/>
+              <w:right w:w="50" w:type="dxa"/>
+            </w:tcMar>
+          </w:tcPr>
+          <w:p>
+            <w:pPr>
+              <w:spacing w:after="20"/>
+              <w:jc w:val="left"/>
+            </w:pPr>
+            <w:r>
+              <w:rPr>
+                <w:rFonts w:ascii="Times New Roman" w:hAnsi="Times New Roman"/>
+                <w:b w:val="0"/>
+                <w:i w:val="0"/>
+                <w:sz w:val="16"/>
+              </w:rPr>
+              <w:t>ResNet-50</w:t>
+            </w:r>
+          </w:p>
+        </w:tc>
+        <w:tc>
+          <w:tcPr>
+            <w:tcW w:type="dxa" w:w="1003"/>
+            <w:tcMar>
+              <w:top w:w="45" w:type="dxa"/>
+              <w:bottom w:w="45" w:type="dxa"/>
+              <w:left w:w="50" w:type="dxa"/>
+              <w:right w:w="50" w:type="dxa"/>
+            </w:tcMar>
+          </w:tcPr>
+          <w:p>
+            <w:pPr>
+              <w:spacing w:after="20"/>
+              <w:jc w:val="left"/>
+            </w:pPr>
+            <w:r>
+              <w:rPr>
+                <w:rFonts w:ascii="Times New Roman" w:hAnsi="Times New Roman"/>
+                <w:b w:val="0"/>
+                <w:i w:val="0"/>
+                <w:sz w:val="16"/>
+              </w:rPr>
+              <w:t>Method A (Telea)</w:t>
+            </w:r>
+          </w:p>
+        </w:tc>
+        <w:tc>
+          <w:tcPr>
+            <w:tcW w:type="dxa" w:w="1003"/>
+            <w:tcMar>
+              <w:top w:w="45" w:type="dxa"/>
+              <w:bottom w:w="45" w:type="dxa"/>
+              <w:left w:w="50" w:type="dxa"/>
+              <w:right w:w="50" w:type="dxa"/>
+            </w:tcMar>
+          </w:tcPr>
+          <w:p>
+            <w:pPr>
+              <w:spacing w:after="20"/>
+              <w:jc w:val="left"/>
+            </w:pPr>
+            <w:r>
+              <w:rPr>
+                <w:rFonts w:ascii="Times New Roman" w:hAnsi="Times New Roman"/>
+                <w:b/>
+                <w:i w:val="0"/>
+                <w:sz w:val="16"/>
+              </w:rPr>
+              <w:t>Core</w:t>
+            </w:r>
+          </w:p>
+        </w:tc>
+        <w:tc>
+          <w:tcPr>
+            <w:tcW w:type="dxa" w:w="1003"/>
+            <w:tcMar>
+              <w:top w:w="45" w:type="dxa"/>
+              <w:bottom w:w="45" w:type="dxa"/>
+              <w:left w:w="50" w:type="dxa"/>
+              <w:right w:w="50" w:type="dxa"/>
+            </w:tcMar>
+          </w:tcPr>
+          <w:p>
+            <w:pPr>
+              <w:spacing w:after="20"/>
+              <w:jc w:val="center"/>
+            </w:pPr>
+            <w:r>
+              <w:rPr>
+                <w:rFonts w:ascii="Times New Roman" w:hAnsi="Times New Roman"/>
+                <w:b w:val="0"/>
+                <w:i w:val="0"/>
+                <w:sz w:val="16"/>
+              </w:rPr>
+              <w:t>0.0138 +/- 0.032</w:t>
+            </w:r>
+          </w:p>
+        </w:tc>
+        <w:tc>
+          <w:tcPr>
+            <w:tcW w:type="dxa" w:w="1003"/>
+            <w:tcMar>
+              <w:top w:w="45" w:type="dxa"/>
+              <w:bottom w:w="45" w:type="dxa"/>
+              <w:left w:w="50" w:type="dxa"/>
+              <w:right w:w="50" w:type="dxa"/>
+            </w:tcMar>
+          </w:tcPr>
+          <w:p>
+            <w:pPr>
+              <w:spacing w:after="20"/>
+              <w:jc w:val="center"/>
+            </w:pPr>
+            <w:r>
+              <w:rPr>
+                <w:rFonts w:ascii="Times New Roman" w:hAnsi="Times New Roman"/>
+                <w:b w:val="0"/>
+                <w:i w:val="0"/>
+                <w:sz w:val="16"/>
+              </w:rPr>
+              <w:t>0.0161 +/- 0.046</w:t>
+            </w:r>
+          </w:p>
+        </w:tc>
+        <w:tc>
+          <w:tcPr>
+            <w:tcW w:type="dxa" w:w="1003"/>
+            <w:tcMar>
+              <w:top w:w="45" w:type="dxa"/>
+              <w:bottom w:w="45" w:type="dxa"/>
+              <w:left w:w="50" w:type="dxa"/>
+              <w:right w:w="50" w:type="dxa"/>
+            </w:tcMar>
+          </w:tcPr>
+          <w:p>
+            <w:pPr>
+              <w:spacing w:after="20"/>
+              <w:jc w:val="center"/>
+            </w:pPr>
+            <w:r>
+              <w:rPr>
+                <w:rFonts w:ascii="Times New Roman" w:hAnsi="Times New Roman"/>
+                <w:b w:val="0"/>
+                <w:i w:val="0"/>
+                <w:sz w:val="16"/>
+              </w:rPr>
+              <w:t>5.6%</w:t>
+            </w:r>
+          </w:p>
+        </w:tc>
+        <w:tc>
+          <w:tcPr>
+            <w:tcW w:type="dxa" w:w="1003"/>
+            <w:tcMar>
+              <w:top w:w="45" w:type="dxa"/>
+              <w:bottom w:w="45" w:type="dxa"/>
+              <w:left w:w="50" w:type="dxa"/>
+              <w:right w:w="50" w:type="dxa"/>
+            </w:tcMar>
+          </w:tcPr>
+          <w:p>
+            <w:pPr>
+              <w:spacing w:after="20"/>
+              <w:jc w:val="center"/>
+            </w:pPr>
+            <w:r>
+              <w:rPr>
+                <w:rFonts w:ascii="Times New Roman" w:hAnsi="Times New Roman"/>
+                <w:b w:val="0"/>
+                <w:i w:val="0"/>
+                <w:sz w:val="16"/>
+              </w:rPr>
+              <w:t>8.21 x 10^-4</w:t>
+            </w:r>
+          </w:p>
+        </w:tc>
+        <w:tc>
+          <w:tcPr>
+            <w:tcW w:type="dxa" w:w="1003"/>
+            <w:tcMar>
+              <w:top w:w="45" w:type="dxa"/>
+              <w:bottom w:w="45" w:type="dxa"/>
+              <w:left w:w="50" w:type="dxa"/>
+              <w:right w:w="50" w:type="dxa"/>
+            </w:tcMar>
+          </w:tcPr>
+          <w:p>
+            <w:pPr>
+              <w:spacing w:after="20"/>
+              <w:jc w:val="center"/>
+            </w:pPr>
+            <w:r>
+              <w:rPr>
+                <w:rFonts w:ascii="Times New Roman" w:hAnsi="Times New Roman"/>
+                <w:b w:val="0"/>
+                <w:i w:val="0"/>
+                <w:sz w:val="16"/>
+              </w:rPr>
+              <w:t>0.350</w:t>
+            </w:r>
+          </w:p>
+        </w:tc>
+      </w:tr>
     </w:tbl>
     <w:p>
       <w:pPr>
@@ -6512,7 +7070,7 @@
           <w:color w:val="1E3A8A"/>
           <w:sz w:val="24"/>
         </w:rPr>
-        <w:t>4.3  Architectural Inductive Bias: ViT vs CNN</w:t>
+        <w:t>4.4  Architectural Inductive Bias: ViT vs CNN</w:t>
       </w:r>
     </w:p>
     <w:p>
@@ -6527,7 +7085,7 @@
           <w:i w:val="0"/>
           <w:sz w:val="22"/>
         </w:rPr>
-        <w:t>Paired test slice comparisons between DeiT-Small and ResNet-50 revealed systematic inductive bias divergences: (1) Tumour Core Reliance: DeiT-Small exhibited substantially higher sensitivity to the tumour core than ResNet-50 under inpainting (tau_core, ViT = 0.0900 vs tau_core, CNN = 0.0161, difference +0.0738, Wilcoxon p = 0.0123, Cohen's d_z = 0.362); (2) Peritumoral Margin Context: DeiT-Small showed higher sensitivity to the immediate margin (+0.0166, p = 0.1124); (3) Remote Context Invariance: Remote sensitivity was near zero for both architectures (tau &lt;= 0.013, difference +0.0072, p = 0.9087), refuting concerns that global self-attention induces spurious sensitivity to distant cranial background tissue.</w:t>
+        <w:t>Paired test slice comparisons between DeiT-Small and ResNet-50 revealed systematic inductive bias divergences (Figure 5): (1) Tumour Core Reliance: In the pooled multi-cohort comparison (N = 90, Method A), DeiT-Small exhibited substantially higher sensitivity to the tumour core than ResNet-50 under inpainting (tau_core, ViT = 0.0900 vs tau_core, CNN = 0.0161, difference +0.0738, Wilcoxon p = 0.0123, Cohen's d_z = 0.362). In the Cheng-specific subset (N = 45), the core sensitivity difference was 0.1282 - 0.0311 = 0.0971 (d_z = 0.368); (2) Peritumoral Margin Context: DeiT-Small showed higher sensitivity to the immediate margin (+0.0166, p = 0.1124) and outer margin (+0.0118); (3) Remote Context Invariance: Remote sensitivity was near zero for both architectures (tau &lt;= 0.013, difference +0.0072, p = 0.9087), refuting concerns that global self-attention induces spurious sensitivity to distant cranial background tissue.</w:t>
       </w:r>
     </w:p>
     <w:p>
@@ -6543,7 +7101,7 @@
           <w:color w:val="1E3A8A"/>
           <w:sz w:val="24"/>
         </w:rPr>
-        <w:t>4.4  Acquisition Plane Stratification and Histopathology</w:t>
+        <w:t>4.5  Perturbation Method Concordance</w:t>
       </w:r>
     </w:p>
     <w:p>
@@ -6558,7 +7116,38 @@
           <w:i w:val="0"/>
           <w:sz w:val="22"/>
         </w:rPr>
-        <w:t>Stratifying BRISC by acquisition plane revealed that the spatial evidence gradient was preserved across all three radiological orientations (Table 3): Axial (tau_core = 0.0337 &gt; tau_immed = 0.0241 &gt; tau_remote = 0.0137); Coronal (0.0298 &gt; 0.0127 &gt; 0.0036); and Sagittal (0.0582 &gt; 0.0461 &gt; 0.0178). Analyzing sensitivity across tumour classes revealed marked alignment with clinical tumor biology (Table 4): Infiltrative gliomas exhibited the highest margin-to-core ratio (35.0%), meningiomas 33.1%, and sellar-confined pituitary adenomas only 15.1%.</w:t>
+        <w:t>Evaluating Method A (Telea boundary PDE inpainting) against Method B (locally matched Gaussian texture filling) confirmed strong concordance in regional evidence ordering (Figure 6). In DeiT-Small, core sensitivity between the two methods was strongly correlated on Cheng (r = 0.881, Spearman rho = 0.864) and on BRISC (r = 0.704, Spearman rho = 0.642). When pooling across models on Cheng, core sensitivity correlation remained high (r = 0.748, Spearman rho = 0.541). For ResNet-50, lower cross-method correlation was observed (r = 0.241 on Cheng), indicating that localized convolutional kernels are more sensitive to high-frequency texture fill boundary transitions than attention mechanisms.</w:t>
+      </w:r>
+    </w:p>
+    <w:p>
+      <w:pPr>
+        <w:keepNext/>
+        <w:spacing w:before="200" w:after="80"/>
+      </w:pPr>
+      <w:r>
+        <w:rPr>
+          <w:rFonts w:ascii="Times New Roman" w:hAnsi="Times New Roman"/>
+          <w:b/>
+          <w:i w:val="0"/>
+          <w:color w:val="1E3A8A"/>
+          <w:sz w:val="24"/>
+        </w:rPr>
+        <w:t>4.6  Acquisition Plane Stratification (BRISC)</w:t>
+      </w:r>
+    </w:p>
+    <w:p>
+      <w:pPr>
+        <w:spacing w:after="120" w:line="276" w:lineRule="auto"/>
+        <w:jc w:val="both"/>
+      </w:pPr>
+      <w:r>
+        <w:rPr>
+          <w:rFonts w:ascii="Times New Roman" w:hAnsi="Times New Roman"/>
+          <w:b w:val="0"/>
+          <w:i w:val="0"/>
+          <w:sz w:val="22"/>
+        </w:rPr>
+        <w:t>Stratifying BRISC by acquisition plane revealed that the spatial evidence gradient was preserved across all three radiological orientations (Table 3; Figure 7): Axial (tau_core = 0.0337 &gt; tau_immed = 0.0241 &gt; tau_remote = 0.0137); Coronal (0.0298 &gt; 0.0127 &gt; 0.0036); and Sagittal (0.0582 &gt; 0.0461 &gt; 0.0178). All three planes independently satisfied the hierarchy tau_core &gt; tau_immediate &gt; tau_remote.</w:t>
       </w:r>
     </w:p>
     <w:p>
@@ -7127,6 +7716,37 @@
     </w:tbl>
     <w:p>
       <w:pPr>
+        <w:keepNext/>
+        <w:spacing w:before="200" w:after="80"/>
+      </w:pPr>
+      <w:r>
+        <w:rPr>
+          <w:rFonts w:ascii="Times New Roman" w:hAnsi="Times New Roman"/>
+          <w:b/>
+          <w:i w:val="0"/>
+          <w:color w:val="1E3A8A"/>
+          <w:sz w:val="24"/>
+        </w:rPr>
+        <w:t>4.7  Exploratory Tumour Class Heterogeneity</w:t>
+      </w:r>
+    </w:p>
+    <w:p>
+      <w:pPr>
+        <w:spacing w:after="120" w:line="276" w:lineRule="auto"/>
+        <w:jc w:val="both"/>
+      </w:pPr>
+      <w:r>
+        <w:rPr>
+          <w:rFonts w:ascii="Times New Roman" w:hAnsi="Times New Roman"/>
+          <w:b w:val="0"/>
+          <w:i w:val="0"/>
+          <w:sz w:val="22"/>
+        </w:rPr>
+        <w:t>Analyzing sensitivity across tumour classes revealed marked differences that correspond with radiological characteristics (Table 4; Figure 8): Gliomas exhibited a high margin-to-core ratio (35.0%, tau_immed = 0.0128 vs tau_core = 0.0366), consistent with radiological infiltrative margins and surrounding signal alteration on CE-T1 MRI; Meningiomas demonstrated high core sensitivity (tau_core = 0.1443) and substantial margin sensitivity (33.1%, tau_immed = 0.0478), reflecting prominent dural-tail enhancement and parenchymal displacement; Pituitary Adenomas exhibited low margin sensitivity (15.1%, tau_immed = 0.0025 vs tau_core = 0.0167), consistent with anatomic circumscription within the sellar region. These class-specific observations represent exploratory radiologic findings derived from 2D CE-T1 MRI classifications without independent histopathological tissue staining.</w:t>
+      </w:r>
+    </w:p>
+    <w:p>
+      <w:pPr>
         <w:spacing w:before="160" w:after="60"/>
       </w:pPr>
       <w:r>
@@ -7184,7 +7804,7 @@
                 <w:color w:val="FFFFFF"/>
                 <w:sz w:val="17"/>
               </w:rPr>
-              <w:t>Tumour Histopathology</w:t>
+              <w:t>Tumour Class</w:t>
             </w:r>
           </w:p>
         </w:tc>
@@ -7702,7 +8322,7 @@
           <w:color w:val="1E3A8A"/>
           <w:sz w:val="24"/>
         </w:rPr>
-        <w:t>4.5  Impact of Benchmark Duplicate Leakage</w:t>
+        <w:t>4.8  Impact of Benchmark Duplicate Leakage</w:t>
       </w:r>
     </w:p>
     <w:p>
@@ -7717,7 +8337,7 @@
           <w:i w:val="0"/>
           <w:sz w:val="22"/>
         </w:rPr>
-        <w:t>Comparing performance between the Contaminated Official Benchmark (N = 1,000) and the Clean De-duplicated Test Set (N = 899) revealed that the 10.1% duplicate leakage severely distorted evaluation metrics. Repeated identical meningioma slices artificially depressed official test macro-F1 (DeiT-Small: 0.3566; ResNet-50: 0.3460). On the clean benchmark, true out-of-sample generalization was revealed (DeiT-Small: 0.5999, a +0.243 correction; ResNet-50: 0.4181).</w:t>
+        <w:t>Comparing performance between the Contaminated Official Benchmark (N = 1,000) and the Clean De-duplicated Test Set (N = 899) revealed that train-test duplicate leakage significantly altered benchmark evaluations (Table 1; Figure 9). The 101 duplicate test images were heavily skewed toward meningiomas (96 of 101). Deduplication shifted the test set class prior: meningiomas decreased from 30.6% (306/1,000) to 23.4% (210/899). Because classifiers struggled with minority-class separation under severe imbalance, repeated identical meningioma slices in the official test set disproportionately penalized macro-F1 (DeiT-Small: 0.3566; ResNet-50: 0.3460). On the clean benchmark, macro-F1 rose to 0.5999 for DeiT-Small and 0.4181 for ResNet-50. DeiT-Small accuracy improved from 0.6875 to 0.7646, whereas ResNet-50 accuracy shifted from 0.6479 to 0.6292. This demonstrates that duplicate leakage distorts benchmark evaluations primarily by altering class composition priors rather than uniformly inflating nominal scores.</w:t>
       </w:r>
     </w:p>
     <w:p>
@@ -7748,7 +8368,7 @@
           <w:i w:val="0"/>
           <w:sz w:val="22"/>
         </w:rPr>
-        <w:t>Our sham-controlled counterfactual audit establishes that deep neural networks trained on contrast-enhanced brain MRI derive diagnostic evidence primarily from intra-tumoural morphology, with non-trivial contributions from immediate peritumoral margins, while remaining robust to remote context. By pairing all regional edits with contralateral normal parenchyma controls, we eliminate generic inpainting artifacts and provide statistically verified proof that models do not rely on distant skull shortcuts.</w:t>
+        <w:t>Our sham-controlled counterfactual audit establishes that deep neural networks trained on contrast-enhanced brain MRI derive diagnostic evidence primarily from intra-tumoural morphology, with non-trivial contributions from immediate peritumoral margins, while remaining robust to remote context. By pairing all regional edits with contralateral normal parenchyma controls, we eliminate generic inpainting artifacts and provide statistically verified evidence that models do not rely on distant skull shortcuts.</w:t>
       </w:r>
     </w:p>
     <w:p>
@@ -7763,7 +8383,7 @@
           <w:i w:val="0"/>
           <w:sz w:val="22"/>
         </w:rPr>
-        <w:t>The observed sensitivity to the 4-pixel immediate transitional margin (tau_immediate approx 0.021 - 0.024) aligns with clinical neuroradiology principles. In neuro-oncology, peritumoral FLAIR/T2 hyperintensity, vasogenic edema, and ill-defined margins are standard diagnostic criteria distinguishing infiltrative high-grade gliomas from well-circumscribed meningiomas.</w:t>
+        <w:t>The observed sensitivity to the 4-pixel immediate transitional margin (tau_immediate approx 0.021 - 0.024) aligns with clinical neuroradiology principles. In neuro-oncology, peritumoral signal alteration, vasogenic edema, and ill-defined margins are standard diagnostic criteria distinguishing infiltrative high-grade gliomas from well-circumscribed meningiomas. Classifiers capitalize on these peripheral cues alongside core contrast enhancement.</w:t>
       </w:r>
     </w:p>
     <w:p>
@@ -7778,7 +8398,7 @@
           <w:i w:val="0"/>
           <w:sz w:val="22"/>
         </w:rPr>
-        <w:t>Our results also provide quantitative evidence regarding architectural inductive biases: Vision Transformers integrated spatial context cleanly, achieving higher core sensitivity (tau approx 0.128 - 0.145) and vastly superior probability calibration (ECE 0.037 vs 0.184) compared to ResNet-50, without succumbing to distant cranial background shortcuts (tau_remote approx 0.013, p &gt; 0.05). Finally, the discovery of 10.1% duplicate leakage in the official BRISC benchmark highlights the critical need for mandatory perceptual hashing and patient-isolated splitting before clinical translation.</w:t>
+        <w:t>Our results also provide quantitative evidence regarding architectural inductive biases: Vision Transformers integrated spatial context cleanly, achieving higher core sensitivity (tau approx 0.128 - 0.145) and vastly superior probability calibration (ECE 0.037 vs 0.184) compared to ResNet-50, without succumbing to distant cranial background shortcuts (tau_remote approx 0.013, p &gt; 0.05). Finally, the discovery of 10.1% duplicate leakage in the official BRISC benchmark highlights the critical need for mandatory perceptual hashing, SHA-256 pixel hash auditing, and patient-isolated splitting before clinical translation.</w:t>
       </w:r>
     </w:p>
     <w:p>
@@ -7809,7 +8429,7 @@
           <w:i w:val="0"/>
           <w:sz w:val="22"/>
         </w:rPr>
-        <w:t>Several limitations must be acknowledged: (1) 2D Slices vs Volumetric 3D MRI: Our analysis evaluated 2D contrast-enhanced slices, whereas clinical radiologists review multi-planar volumetric 3D series across multiple sequences (T1, T1+C, T2, FLAIR); (2) Synthetic Inpainting Fidelity: While inpainting satisfied strict non-target invariance (0.00 x 10^0 outside mask), synthetic fills do not fully replicate the physiological appearance of healthy uncompressed brain tissue post-resection; (3) Multi-Center Cohort Scope: Future audits should expand to multi-sequence cohorts across diverse scanner vendors.</w:t>
+        <w:t>Several limitations must be acknowledged: (1) 2D Slices vs Volumetric 3D MRI: Our analysis evaluated 2D contrast-enhanced slices, whereas clinical radiologists review multi-planar volumetric 3D series across multiple sequences (T1, T1+C, T2, FLAIR); (2) Synthetic Inpainting Fidelity: While inpainting satisfied strict non-target invariance (0.00 x 10^0 outside mask), synthetic fills do not fully replicate the physiological appearance of healthy uncompressed brain tissue post-resection; (3) Exploratory Class-Level Inferences: Tumour class comparisons reflect radiologic appearances on 2D T1-CE scans and should not be interpreted as direct histopathological confirmations.</w:t>
       </w:r>
     </w:p>
     <w:p>
@@ -7840,7 +8460,7 @@
           <w:i w:val="0"/>
           <w:sz w:val="22"/>
         </w:rPr>
-        <w:t>This study provides a rigorous, sham-controlled counterfactual audit of deep learning models in contrast-enhanced brain MRI classification. We confirm a steep monotonic spatial evidence gradient: models rely primarily on the tumour core, extract secondary diagnostic evidence from immediate transitional margins, and remain invariant to remote parenchyma. Vision Transformers exhibit superior intra-lesion core reliance and probability calibration compared to CNNs. Crucially, the discovery of 10.1% duplicate leakage in the BRISC benchmark underscores the imperative for rigorous data auditing in clinical AI.</w:t>
+        <w:t>This study provides a rigorous, sham-controlled counterfactual audit of deep learning models in contrast-enhanced brain MRI classification. We confirm a spatial evidence hierarchy: models rely primarily on the tumour core, extract secondary diagnostic evidence from immediate transitional margins, and remain invariant to remote parenchyma. Vision Transformers exhibit superior intra-lesion core reliance and probability calibration compared to CNNs. Crucially, the discovery of 10.1% duplicate leakage in the BRISC benchmark underscores the imperative for rigorous data auditing and transparent sample accounting in clinical AI.</w:t>
       </w:r>
     </w:p>
     <w:p>
@@ -7925,7 +8545,7 @@
           <w:i w:val="0"/>
           <w:sz w:val="21"/>
         </w:rPr>
-        <w:t>This study utilized publicly available, fully de-identified retrospective magnetic resonance imaging datasets (Cheng et al., 2015; Fateh et al., 2026). No new human or animal subjects were recruited, and institutional ethical review approval was not required.</w:t>
+        <w:t>This study utilized publicly available, fully de-identified retrospective magnetic resonance imaging datasets [2, 5]. No new human or animal subjects were recruited, and institutional ethical review approval was not required.</w:t>
       </w:r>
     </w:p>
     <w:p>
@@ -7994,7 +8614,7 @@
           <w:i w:val="0"/>
           <w:sz w:val="21"/>
         </w:rPr>
-        <w:t>The Cheng dataset is publicly accessible at Figshare (doi:10.6084/m9.figshare.1512427). The BRISC dataset is publicly available at Kaggle and Scientific Data (doi:10.1038/s41597-026-04123-x). Audited manifests, split files, and deduplication mappings are openly provided in the repository.</w:t>
+        <w:t>The Cheng dataset is publicly accessible at Figshare (doi:10.6084/m9.figshare.1512427). The BRISC dataset is publicly available at Kaggle and Scientific Data (doi:10.1038/s41597-026-06753-y). Audited manifests, split files, and deduplication mappings are openly provided in the repository.</w:t>
       </w:r>
     </w:p>
     <w:p>
@@ -8071,7 +8691,7 @@
           <w:i w:val="0"/>
           <w:sz w:val="19"/>
         </w:rPr>
-        <w:t xml:space="preserve">1. </w:t>
+        <w:t xml:space="preserve">[1] </w:t>
       </w:r>
       <w:r>
         <w:rPr>
@@ -8095,7 +8715,7 @@
           <w:i w:val="0"/>
           <w:sz w:val="19"/>
         </w:rPr>
-        <w:t xml:space="preserve">2. </w:t>
+        <w:t xml:space="preserve">[2] </w:t>
       </w:r>
       <w:r>
         <w:rPr>
@@ -8119,7 +8739,7 @@
           <w:i w:val="0"/>
           <w:sz w:val="19"/>
         </w:rPr>
-        <w:t xml:space="preserve">3. </w:t>
+        <w:t xml:space="preserve">[3] </w:t>
       </w:r>
       <w:r>
         <w:rPr>
@@ -8128,7 +8748,7 @@
           <w:i w:val="0"/>
           <w:sz w:val="19"/>
         </w:rPr>
-        <w:t>Rossi, F. et al. (2024). TACE: Tumour-Aware Counterfactual Explanations for Medical Image Analysis. IEEE Transactions on Medical Imaging, 43(5), pp.1820–1831. doi:10.1109/TMI.2024.3364120.</w:t>
+        <w:t>Rossi, F., Lopez, R. and Comminiello, D. (2024). TACE: Tumor-Aware Counterfactual Explanations for Medical Image Analysis. arXiv preprint, arXiv:2409.13045. doi:10.48550/arXiv.2409.13045.</w:t>
       </w:r>
     </w:p>
     <w:p>
@@ -8143,7 +8763,7 @@
           <w:i w:val="0"/>
           <w:sz w:val="19"/>
         </w:rPr>
-        <w:t xml:space="preserve">4. </w:t>
+        <w:t xml:space="preserve">[4] </w:t>
       </w:r>
       <w:r>
         <w:rPr>
@@ -8152,7 +8772,7 @@
           <w:i w:val="0"/>
           <w:sz w:val="19"/>
         </w:rPr>
-        <w:t>Sourget, T. et al. (2025). Region-Resolved Faithfulness in Deep Neuro-Oncology Classifiers. NeuroImage, 305, p.120950. doi:10.1016/j.neuroimage.2025.120950.</w:t>
+        <w:t>Sourget, T., Pizurica, A. et al. (2024). Mask of Truth: Model Sensitivity to Unexpected Regions of Medical Images. Lecture Notes in Computer Science (MICCAI Workshops), 15004, pp.439–449. doi:10.1007/978-3-031-72384-1_43.</w:t>
       </w:r>
     </w:p>
     <w:p>
@@ -8167,7 +8787,7 @@
           <w:i w:val="0"/>
           <w:sz w:val="19"/>
         </w:rPr>
-        <w:t xml:space="preserve">5. </w:t>
+        <w:t xml:space="preserve">[5] </w:t>
       </w:r>
       <w:r>
         <w:rPr>
@@ -8176,7 +8796,7 @@
           <w:i w:val="0"/>
           <w:sz w:val="19"/>
         </w:rPr>
-        <w:t>Fateh, A. et al. (2026). BRISC: A Large-Scale Benchmark Dataset for Brain MRI Image Segmentation and Classification. Scientific Data, 13, p.412. doi:10.1038/s41597-026-04123-x.</w:t>
+        <w:t>Fateh, A. et al. (2026). BRISC: Annotated Dataset for Brain Tumor Segmentation and Classification. Scientific Data, 13, p.412. doi:10.1038/s41597-026-06753-y.</w:t>
       </w:r>
     </w:p>
     <w:p>
@@ -8191,7 +8811,7 @@
           <w:i w:val="0"/>
           <w:sz w:val="19"/>
         </w:rPr>
-        <w:t xml:space="preserve">6. </w:t>
+        <w:t xml:space="preserve">[6] </w:t>
       </w:r>
       <w:r>
         <w:rPr>
@@ -8215,7 +8835,7 @@
           <w:i w:val="0"/>
           <w:sz w:val="19"/>
         </w:rPr>
-        <w:t xml:space="preserve">7. </w:t>
+        <w:t xml:space="preserve">[7] </w:t>
       </w:r>
       <w:r>
         <w:rPr>
@@ -8239,7 +8859,7 @@
           <w:i w:val="0"/>
           <w:sz w:val="19"/>
         </w:rPr>
-        <w:t xml:space="preserve">8. </w:t>
+        <w:t xml:space="preserve">[8] </w:t>
       </w:r>
       <w:r>
         <w:rPr>
@@ -8263,7 +8883,7 @@
           <w:i w:val="0"/>
           <w:sz w:val="19"/>
         </w:rPr>
-        <w:t xml:space="preserve">9. </w:t>
+        <w:t xml:space="preserve">[9] </w:t>
       </w:r>
       <w:r>
         <w:rPr>
@@ -8287,7 +8907,7 @@
           <w:i w:val="0"/>
           <w:sz w:val="19"/>
         </w:rPr>
-        <w:t xml:space="preserve">10. </w:t>
+        <w:t xml:space="preserve">[10] </w:t>
       </w:r>
       <w:r>
         <w:rPr>
@@ -8311,7 +8931,7 @@
           <w:i w:val="0"/>
           <w:sz w:val="19"/>
         </w:rPr>
-        <w:t xml:space="preserve">11. </w:t>
+        <w:t xml:space="preserve">[11] </w:t>
       </w:r>
       <w:r>
         <w:rPr>
@@ -8335,7 +8955,7 @@
           <w:i w:val="0"/>
           <w:sz w:val="19"/>
         </w:rPr>
-        <w:t xml:space="preserve">12. </w:t>
+        <w:t xml:space="preserve">[12] </w:t>
       </w:r>
       <w:r>
         <w:rPr>
@@ -8359,7 +8979,7 @@
           <w:i w:val="0"/>
           <w:sz w:val="19"/>
         </w:rPr>
-        <w:t xml:space="preserve">13. </w:t>
+        <w:t xml:space="preserve">[13] </w:t>
       </w:r>
       <w:r>
         <w:rPr>
@@ -8383,7 +9003,7 @@
           <w:i w:val="0"/>
           <w:sz w:val="19"/>
         </w:rPr>
-        <w:t xml:space="preserve">14. </w:t>
+        <w:t xml:space="preserve">[14] </w:t>
       </w:r>
       <w:r>
         <w:rPr>
@@ -8407,7 +9027,7 @@
           <w:i w:val="0"/>
           <w:sz w:val="19"/>
         </w:rPr>
-        <w:t xml:space="preserve">15. </w:t>
+        <w:t xml:space="preserve">[15] </w:t>
       </w:r>
       <w:r>
         <w:rPr>
@@ -8678,7 +9298,7 @@
       <w:r>
         <w:drawing>
           <wp:inline xmlns:a="http://schemas.openxmlformats.org/drawingml/2006/main" xmlns:pic="http://schemas.openxmlformats.org/drawingml/2006/picture">
-            <wp:extent cx="5486400" cy="3021734"/>
+            <wp:extent cx="5486400" cy="3020602"/>
             <wp:docPr id="5" name="Picture 5"/>
             <wp:cNvGraphicFramePr>
               <a:graphicFrameLocks noChangeAspect="1"/>
@@ -8699,7 +9319,7 @@
                   <pic:spPr>
                     <a:xfrm>
                       <a:off x="0" y="0"/>
-                      <a:ext cx="5486400" cy="3021734"/>
+                      <a:ext cx="5486400" cy="3020602"/>
                     </a:xfrm>
                     <a:prstGeom prst="rect"/>
                   </pic:spPr>
@@ -8722,7 +9342,7 @@
           <w:i w:val="0"/>
           <w:sz w:val="18"/>
         </w:rPr>
-        <w:t>Figure 5: Architectural Inductive Bias: ViT vs CNN Regional Sensitivity Profile. Difference plot (tau_ViT - tau_CNN) highlighting DeiT-Small's enhanced reliance on intra-lesion core and transitional margin evidence.</w:t>
+        <w:t>Figure 5: Architectural Inductive Bias: ViT vs CNN Regional Sensitivity Profile (Method A). Difference plot (tau_ViT - tau_CNN) highlighting DeiT-Small's enhanced reliance on intra-lesion core and transitional margin evidence.</w:t>
       </w:r>
     </w:p>
     <w:p>
@@ -8736,7 +9356,7 @@
       <w:r>
         <w:drawing>
           <wp:inline xmlns:a="http://schemas.openxmlformats.org/drawingml/2006/main" xmlns:pic="http://schemas.openxmlformats.org/drawingml/2006/picture">
-            <wp:extent cx="5486400" cy="2438400"/>
+            <wp:extent cx="5486400" cy="2607798"/>
             <wp:docPr id="6" name="Picture 6"/>
             <wp:cNvGraphicFramePr>
               <a:graphicFrameLocks noChangeAspect="1"/>
@@ -8757,7 +9377,7 @@
                   <pic:spPr>
                     <a:xfrm>
                       <a:off x="0" y="0"/>
-                      <a:ext cx="5486400" cy="2438400"/>
+                      <a:ext cx="5486400" cy="2607798"/>
                     </a:xfrm>
                     <a:prstGeom prst="rect"/>
                   </pic:spPr>
@@ -8780,7 +9400,7 @@
           <w:i w:val="0"/>
           <w:sz w:val="18"/>
         </w:rPr>
-        <w:t>Figure 6: Perturbation Method Invariance (Method A vs Method B). Paired sensitivity comparison between Telea boundary PDE inpainting and locally matched Gaussian texture filling across ResNet-50 and DeiT-Small.</w:t>
+        <w:t>Figure 6: Perturbation Method Concordance: Telea Inpaint vs Matched Texture Fill. Paired sensitivity comparison between Telea boundary PDE inpainting and locally matched Gaussian texture filling across ResNet-50 and DeiT-Small.</w:t>
       </w:r>
     </w:p>
     <w:p>
@@ -8852,7 +9472,7 @@
       <w:r>
         <w:drawing>
           <wp:inline xmlns:a="http://schemas.openxmlformats.org/drawingml/2006/main" xmlns:pic="http://schemas.openxmlformats.org/drawingml/2006/picture">
-            <wp:extent cx="5486400" cy="2876006"/>
+            <wp:extent cx="5486400" cy="3067594"/>
             <wp:docPr id="8" name="Picture 8"/>
             <wp:cNvGraphicFramePr>
               <a:graphicFrameLocks noChangeAspect="1"/>
@@ -8873,7 +9493,7 @@
                   <pic:spPr>
                     <a:xfrm>
                       <a:off x="0" y="0"/>
-                      <a:ext cx="5486400" cy="2876006"/>
+                      <a:ext cx="5486400" cy="3067594"/>
                     </a:xfrm>
                     <a:prstGeom prst="rect"/>
                   </pic:spPr>
@@ -8910,7 +9530,7 @@
       <w:r>
         <w:drawing>
           <wp:inline xmlns:a="http://schemas.openxmlformats.org/drawingml/2006/main" xmlns:pic="http://schemas.openxmlformats.org/drawingml/2006/picture">
-            <wp:extent cx="5486400" cy="3055716"/>
+            <wp:extent cx="5486400" cy="2379044"/>
             <wp:docPr id="9" name="Picture 9"/>
             <wp:cNvGraphicFramePr>
               <a:graphicFrameLocks noChangeAspect="1"/>
@@ -8931,7 +9551,7 @@
                   <pic:spPr>
                     <a:xfrm>
                       <a:off x="0" y="0"/>
-                      <a:ext cx="5486400" cy="3055716"/>
+                      <a:ext cx="5486400" cy="2379044"/>
                     </a:xfrm>
                     <a:prstGeom prst="rect"/>
                   </pic:spPr>
@@ -8954,7 +9574,7 @@
           <w:i w:val="0"/>
           <w:sz w:val="18"/>
         </w:rPr>
-        <w:t>Figure 9: Impact of Train-Test Duplicate Leakage on Benchmark Evaluation (BRISC). Dual-benchmark comparison between the Contaminated Official Test (N=1,000, 10.1% leakage) and the Clean De-duplicated Test (N=899).</w:t>
+        <w:t>Figure 9: Impact of Train-Test Duplicate Leakage on Benchmark Evaluation (BRISC). Dual-benchmark comparison between the Contaminated Official Test (N=1,000, 10.1% leakage) and the Clean De-duplicated Test (N=899) across DeiT-Small and ResNet-50.</w:t>
       </w:r>
     </w:p>
     <w:p>

</xml_diff>

<commit_message>
fix(manuscript): reconcile 5 audit reviews on sample accounting, patient clustering, brisc export, and config sync
</commit_message>
<xml_diff>
--- a/Brain_MRI_Research_Paper_Final.docx
+++ b/Brain_MRI_Research_Paper_Final.docx
@@ -165,7 +165,7 @@
           <w:i w:val="0"/>
           <w:sz w:val="20"/>
         </w:rPr>
-        <w:t>Deep convolutional neural networks (CNNs) and Vision Transformers (ViTs) regularly report high benchmark accuracy for classifying primary intracranial neoplasms from contrast-enhanced magnetic resonance imaging (CE-MRI). However, standard evaluation protocols fail to disentangle whether high diagnostic accuracy reflects genuine reliance on intra-lesional tumour morphology, opportunistic exploitation of peritumoral transitional zones, or spurious shortcut learning from remote cranial background context and scanner acquisition artifacts (the 'Clever Hans' effect).</w:t>
+        <w:t>Deep convolutional neural networks (CNNs) and Vision Transformers (ViTs) regularly report high benchmark accuracy for classifying primary intracranial neoplasms from contrast-enhanced magnetic resonance imaging (CE-MRI). However, standard evaluation protocols evaluate models exclusively on unmodified images, failing to disentangle whether high diagnostic accuracy reflects genuine reliance on intra-lesional tumour morphology, opportunistic exploitation of peritumoral transitional zones, or spurious shortcut learning from remote cranial background context and scanner acquisition artifacts (the 'Clever Hans' effect).</w:t>
       </w:r>
     </w:p>
     <w:p>
@@ -188,7 +188,7 @@
           <w:i w:val="0"/>
           <w:sz w:val="20"/>
         </w:rPr>
-        <w:t>We establish a literature-informed, fully reproducible counterfactual evaluation framework to audit region-resolved evidence across the Cheng brain tumour MRI dataset (N = 3,064 slices, 233 patients) and the multi-plane BRISC dataset (N = 6,000 slices). Before model evaluation, an automated data leakage and deduplication audit was conducted. In Cheng, a 5-fold cross-validation scheme was strictly grouped by patient ID, guaranteeing zero patient overlap across partitions. In BRISC, an automated perceptual hashing and SHA-256 pixel matrix audit revealed 159 exact duplicate image pairs, identifying that 101 test slices (10.1% of the official 1,000-slice test set) share identical decoded pixel hashes with training/validation images; a clean de-duplicated benchmark (N = 899; 759 mask-supported) was established. We trained ImageNet-pretrained ResNet-50 (CNN) and DeiT-Small/16 (ViT) architectures. We engineered a five-region topological taxonomy for each slice: tumour core (R_core), immediate peritumoral margin (R_immediate, 4-pixel dilation ring), outer margin (R_outer, 12-pixel ring), remote brain parenchyma (R_remote), and an area- and contour-matched contralateral sham control (R_sham). Two complementary perturbation engines were implemented: Method A (Telea boundary PDE inpainting) and Method B (locally matched Gaussian texture filling). In total, 1,200 counterfactual interventions were generated and verified with 100% compliance to strict non-target pixel invariance (|Delta| &lt; 10^-5 outside mask). We evaluated 1,800 paired counterfactual observations, computing raw sensitivity (Delta_r = p_y(x) - p_y(x_edit, r)) and sham-corrected region sensitivity (tau_r = Delta_r - Delta_sham), paired Wilcoxon signed-rank tests, and Cohen's d_z effect sizes.</w:t>
+        <w:t>We establish a literature-informed, fully reproducible counterfactual evaluation framework to audit region-resolved diagnostic evidence across the Cheng brain tumour MRI cohort (N = 3,064 slices, 233 patients) and the multi-plane BRISC benchmark (N = 6,000 slices). Before model evaluation, an automated data leakage and deduplication audit was conducted. In Cheng, a 5-fold cross-validation scheme was strictly grouped by patient ID, guaranteeing zero patient overlap across folds; baseline validation was evaluated on the patient-isolated held-out Fold 1 test partition (N = 480 slices, 49 patients). In BRISC, an automated perceptual hashing and SHA-256 pixel matrix audit revealed 159 exact duplicate image pairs; among these, 110 pairs cross the official train-test split boundary, involving 101 unique test slices (10.1% of the official 1,000-slice test set; 96 meningiomas, 5 pituitary adenomas). In light of published deduplication claims in the BRISC data descriptor, we treat this finding as an archive-specific empirical observation and report both the official benchmark (N = 1,000) and a de-duplicated clean benchmark (N = 899; 759 mask-supported). We trained ImageNet-pretrained ResNet-50 (CNN) and DeiT-Small/16 (ViT) architectures using AdamW (batch size 16, weight decay 10^-2, initial learning rate 10^-4 for ResNet-50 with dropout 0.2, 5 x 10^-5 for DeiT-Small with dropout 0.1, 1-epoch linear warmup, early stopping patience 3, max 5 epochs). We engineered a five-region topological taxonomy for each slice: tumour core (R_core), immediate peritumoral margin (R_immediate, 4-pixel dilation ring), outer margin (R_outer, 12-pixel ring), remote brain parenchyma (R_remote), and an area- and contour-matched contralateral sham control (R_sham). Two complementary perturbation engines were implemented: Method A (Telea boundary PDE inpainting) and Method B (locally matched Gaussian texture filling). In total, 1,200 counterfactual interventions were verified with 100% strict non-target pixel invariance (|Delta| &lt; 10^-5 outside mask). We evaluated 1,800 paired counterfactual observations across models and datasets, computing raw sensitivity (Delta_r = p_y(x) - p_y(x_edit, r)) and sham-corrected region sensitivity (tau_r = Delta_r - Delta_sham), paired Wilcoxon signed-rank tests, patient-clustered analyses across patient clusters, and Cohen's d_z effect sizes.</w:t>
       </w:r>
     </w:p>
     <w:p>
@@ -211,7 +211,7 @@
           <w:i w:val="0"/>
           <w:sz w:val="20"/>
         </w:rPr>
-        <w:t>Perturbing the tumour core produced the largest, highly statistically significant evidence drop across both architectures (p &lt; 10^-5 on Cheng, p &lt; 0.01 on BRISC). On Cheng (N = 45), DeiT-Small demonstrated a sham-corrected sensitivity of tau_core = 0.128 +/- 0.245 (p = 9.13 x 10^-6, d_z = 0.518) under inpainting and tau_core = 0.145 +/- 0.214 (p = 3.09 x 10^-8, d_z = 0.669) under texture filling. ResNet-50 on Cheng showed tau_core = 0.031 +/- 0.056 (p = 6.54 x 10^-4, d_z = 0.548) under inpainting. In a pooled multi-cohort comparison (N = 90), DeiT-Small exhibited significantly greater core evidence reliance than ResNet-50 (tau_core, ViT = 0.0900 vs tau_core, CNN = 0.0161, difference +0.0738, p = 0.0123, d_z = 0.362) alongside superior probability calibration (Cheng Expected Calibration Error: DeiT-Small 0.037 vs ResNet-50 0.184). Immediate peritumoral margin modifications also induced statistically significant evidence drops (tau_immediate = 0.021 +/- 0.095, p = 0.0267 on Cheng; tau_immediate = 0.024 +/- 0.044, p = 4.70 x 10^-4 on BRISC for DeiT-Small). In contrast, perturbing remote parenchyma produced small shifts indistinguishable from sham controls (tau_remote &lt;= 0.018, p &gt; 0.05). In BRISC, the evidence hierarchy was preserved across Axial, Coronal, and Sagittal acquisition planes. Exploratory radiologic analysis across tumor classes showed that gliomas exhibited a substantial margin-to-core sensitivity ratio (35.0%), whereas sellar-confined pituitary adenomas showed minimal margin dependence (15.1%). Finally, the 101 duplicate test images in BRISC (predominantly meningiomas) shifted test class priors (meningiomas dropping from 30.6% to 23.4% upon deduplication), substantially altering macro-F1 (DeiT-Small: 0.3566 official vs 0.5999 clean; ResNet-50: 0.3460 official vs 0.4181 clean).</w:t>
+        <w:t>Perturbing the tumour core produced the largest evidence drop under boundary PDE inpainting across both models (p &lt; 10^-3). On Cheng (N = 45 slices across N = 10 patient clusters), DeiT-Small demonstrated a sham-corrected sensitivity of tau_core = 0.1282 +/- 0.245 (slice-level Wilcoxon p = 9.13 x 10^-6, patient-clustered Wilcoxon p = 0.0488, d_z = 0.518) under inpainting and tau_core = 0.1449 +/- 0.214 under texture filling. ResNet-50 on Cheng showed tau_core = 0.0311 +/- 0.056 (slice-level p = 6.54 x 10^-4, patient-clustered p = 0.0488, d_z = 0.548) under inpainting. In a pooled multi-cohort comparison (N = 90, Method A), DeiT-Small exhibited significantly greater core evidence reliance than ResNet-50 (tau_core, ViT = 0.0900 vs tau_core, CNN = 0.0161, difference +0.0738, paired Wilcoxon p = 0.0123, d_z = 0.362) alongside superior probability calibration (Cheng Expected Calibration Error: DeiT-Small 0.0366 vs ResNet-50 0.1835). Immediate peritumoral margin modifications also induced statistically significant evidence drops (tau_immediate = 0.0213 +/- 0.095, p = 0.0267 on Cheng; tau_immediate = 0.0242 +/- 0.044, p = 4.70 x 10^-4 on BRISC for DeiT-Small). Spatial evidence decay was condition- and method-dependent: while core dominance held strongly under inpainting, outer margin (12-pixel ring) edits under Gaussian texture filling and in skull-stripped BRISC scans produced effects comparable to or exceeding the core (tau approx 0.056 - 0.070), reflecting both large annular mask tissue volume covering vasogenic edema and convolutional sensitivity to high-frequency boundary textures. Remote parenchyma edits yielded negligible shifts indistinguishable from sham controls (p &gt; 0.05). Exploratory radiologic analysis showed that gliomas exhibited a substantial margin-to-core sensitivity ratio (35.0%), whereas sellar-confined pituitary adenomas showed minimal margin dependence (15.1%). Finally, the 101 duplicate test images in BRISC shifted test class priors (meningiomas dropping from 30.6% to 23.4% upon deduplication), altering macro-F1 (DeiT-Small: 0.3566 official vs 0.5999 clean; ResNet-50: 0.3460 official vs 0.4181 clean).</w:t>
       </w:r>
     </w:p>
     <w:p>
@@ -234,7 +234,7 @@
           <w:i w:val="0"/>
           <w:sz w:val="20"/>
         </w:rPr>
-        <w:t>Contrast-enhanced brain tumour classifiers derive diagnostic evidence primarily from intra-tumoural features, with non-trivial contributions from immediate transitional margins, while remaining robust to remote context. ViTs demonstrate stronger core feature sensitivity and superior probability calibration compared to CNNs. However, duplicate leakage and class-prior shifts in public benchmarks underscore the critical necessity of rigorous data auditing and transparent sample accounting before clinical interpretation.</w:t>
+        <w:t>Contrast-enhanced brain tumour classifiers derive diagnostic evidence primarily from intra-tumoural morphology, with non-trivial contributions from immediate transitional margins, while remaining robust to remote context. ViTs demonstrate stronger core feature sensitivity and superior probability calibration compared to CNNs. However, duplicate leakage and class-prior shifts in public benchmarks underscore the critical necessity of rigorous data auditing, patient-clustered evaluation, and transparent sample accounting before clinical interpretation.</w:t>
       </w:r>
     </w:p>
     <w:p>
@@ -1534,7 +1534,7 @@
           <w:i w:val="0"/>
           <w:sz w:val="22"/>
         </w:rPr>
-        <w:t>To ensure complete transparency and reproducibility across all reported tables and figures, the exact sample flow and selection rules are structured as follows: (1) Baseline Evaluation Partitions: For Cheng (N = 3,064 slices across 233 patients), out-of-fold (OOF) cross-validation was evaluated on a standardized test batch of N = 480 slices (15 balanced minibatches of 32 slices across folds). For BRISC, evaluation was conducted on both the Contaminated Official Test set (N = 1,000, with a standardized N = 480 test batch) and the de-duplicated Clean Test set (N = 899; 759 mask-supported); (2) Counterfactual Intervention Edits (N = 1,200): Generated across 60 representative slices (30 from Cheng, 30 from BRISC) across 5 regions (R_core, R_immediate, R_outer, R_remote, R_sham) using 2 perturbation engines (Method A: Telea inpaint; Method B: Gaussian texture fill), yielding 60 x 5 x 2 x 2 = 1,200 edited slices recorded in manifests/intervention_qc.csv; (3) Paired Counterfactual Observations (N = 1,800): Evaluated across 45 matched patient slices per dataset (N = 90 total) across 5 regions, 2 perturbation methods, and 2 model architectures (ResNet-50 and DeiT-Small). In Cheng, 45 slices comprise 15 Gliomas, 15 Meningiomas, and 15 Pituitary Adenomas (N = 15 per class). In BRISC, 45 slices comprise 15 Axial, 15 Coronal, and 15 Sagittal slices (N = 15 per acquisition plane). Total evaluated paired rows = 90 slices x 5 regions x 2 methods x 2 architectures = 1,800 rows in predictions/intervention_effects.csv.</w:t>
+        <w:t>To ensure complete transparency and reproducibility across all reported tables and figures, the exact sample flow and selection rules are structured as follows: (1) Baseline Evaluation Partitions: For Cheng (N = 3,064 slices across 233 patients), a 5-fold patient-isolated cross-validation split was created. The saved prediction files in predictions/ contain exactly N = 480 records, all belonging to Fold 1 (evaluated across 49 unseen patients). Slices from folds 2-5 are not included in these exported prediction logs; this partition is therefore strictly designated as the Patient-Isolated Held-Out Fold 1 Test Partition (N = 480) rather than an aggregated all-fold OOF set. For BRISC, the saved test prediction files in predictions/ contain exactly N = 480 rows comprising 254 gliomas and 226 meningiomas, representing the mask-supported neoplasm test batches evaluated for the counterfactual audit. Pituitary adenoma and no-tumour control slices are not present in these specific 480-row export files. The full benchmark-wide metrics for the Official Test (N = 1,000) and Clean Test (N = 899) originate from the comprehensive multi-class evaluation logs in reports/baseline_training_report.md; (2) Counterfactual Intervention Edits (N = 1,200): Generated across 60 representative slices (30 from Cheng, 30 from BRISC) across 5 regions (R_core, R_immediate, R_outer, R_remote, R_sham) using 2 perturbation engines (Method A: Telea inpaint; Method B: Gaussian texture fill), yielding 60 x 5 x 2 x 2 = 1,200 edited slices recorded in manifests/intervention_qc.csv; (3) Paired Counterfactual Observations (N = 1,800): Evaluated across 45 matched patient slices per dataset (N = 90 total) across 5 regions, 2 perturbation methods, and 2 model architectures (ResNet-50 and DeiT-Small). In Cheng, the 45 slices comprise 15 Gliomas, 15 Meningiomas, and 15 Pituitary Adenomas (N = 15 per class). Crucially, these 45 Cheng slices originate from N = 10 unique patient clusters (ranging from 3 to 7 slices per patient). In BRISC, the 45 slices comprise 15 Axial, 15 Coronal, and 15 Sagittal slices (N = 15 per acquisition plane). Total evaluated paired rows = 90 slices x 5 regions x 2 methods x 2 architectures = 1,800 rows in predictions/intervention_effects.csv.</w:t>
       </w:r>
     </w:p>
     <w:p>
@@ -1565,7 +1565,7 @@
           <w:i w:val="0"/>
           <w:sz w:val="22"/>
         </w:rPr>
-        <w:t>To prevent patient-level memorization leakage [6], a 5-fold cross-validation split was established on Cheng using StratifiedGroupKFold on patient ID. Automated set intersection verified zero patient overlap across folds. On BRISC, Fateh et al. [5] describe applying deduplication prior to partitioning in their data descriptor. However, an automated perceptual hashing audit across the distributed image files revealed 159 exact duplicate pairs (278 unique images). Decoded SHA-256 pixel matrix verification confirmed that all 159 pairs possess bitwise identical image pixel arrays (np.array_equal == True). Among these, 110 pairs cross the official train-test split boundary, involving 101 unique test slices (10.1% of the 1,000-slice test set) that are byte-identical copies of training/validation images (96 meningiomas and 5 pituitary adenomas). We established the BRISC Clean Test Set (N = 899; 759 mask-supported clean slices) and a clean validation split (N = 1,001 val, N = 3,999 train) with zero train-validation leakage. Deduplication screening between Cheng and BRISC confirmed 0 duplicate pairs and SSIM values &lt; 0.58.</w:t>
+        <w:t>To prevent patient-level memorization leakage [6], a 5-fold cross-validation split was established on Cheng using StratifiedGroupKFold on patient ID. Automated set intersection verified zero patient overlap across folds (Intersection = empty set). On BRISC, the peer-reviewed data descriptor by Fateh et al. [5] (Scientific Data, 2026) describes applying deduplication prior to partitioning. However, in our local evaluated archive files (manifests/duplicate_pairs.csv), perceptual hashing (pHash, dHash, aHash) and decoded SHA-256 pixel matrix verification identified 159 exact duplicate image pairs (np.array_equal == True). Among these, 110 pairs cross the official train-test split boundary, involving 101 unique test slices (10.1% of the 1,000-slice test set) that are byte-identical copies of training/validation images (96 meningiomas and 5 pituitary adenomas). Because external replication audits report varying hash-cleaning counts, we present this local finding as an empirical observation specific to the downloaded archive release rather than a definitive indictment of the published benchmark design. We report both the official benchmark (N = 1,000) and the local de-duplicated clean subset (N = 899; 759 mask-supported clean slices) side-by-side. Deduplication screening between Cheng and BRISC confirmed 0 duplicate pairs and SSIM values &lt; 0.58.</w:t>
       </w:r>
     </w:p>
     <w:p>
@@ -1627,7 +1627,7 @@
           <w:i w:val="0"/>
           <w:sz w:val="22"/>
         </w:rPr>
-        <w:t>We evaluated two representative architectures: (1) ResNet-50 (CNN, 23.51M parameters) with IMAGENET1K_V2 pretrained weights [7]; (2) DeiT-Small/16 (ViT, 21.66M parameters) operating on 16 x 16 patches with global self-attention across 12 transformer layers [8]. Models were optimized using AdamW with an initial learning rate of 1 x 10^-4 and weight decay of 1 x 10^-2. Training was conducted for 5 epochs per fold/split with a batch size of 32, using a cosine annealing schedule following a 2-epoch linear warmup. Standard cross-entropy loss was minimized with random seed 42.</w:t>
+        <w:t>Models were configured in strict concordance with configs/training.yaml: (1) ResNet-50 (CNN, 23.51M parameters) with IMAGENET1K_V2 pretrained weights [7], linear classification head, Dropout p = 0.2, and initial learning rate 1 x 10^-4; (2) DeiT-Small/16 (ViT, 21.66M parameters) operating on 16 x 16 patches with global self-attention across 12 transformer layers [8], class token projection head, Dropout p = 0.1, and initial learning rate 5 x 10^-5. Both architectures were optimized using AdamW with weight decay of 1 x 10^-2 and batch size 16. Training was conducted for up to 5 epochs per fold/split with early stopping patience of 3 epochs on validation macro-F1, following a 1-epoch linear warmup and cosine annealing schedule. Standard cross-entropy loss was minimized with random seed 42.</w:t>
       </w:r>
     </w:p>
     <w:p>
@@ -1720,7 +1720,7 @@
           <w:i w:val="0"/>
           <w:sz w:val="22"/>
         </w:rPr>
-        <w:t>For each slice x and class y, we extracted baseline probability p_y(x) and edited probability p_y(x_edit, r). We computed: Raw Evidence Drop Delta_r(x) = p_y(x) - p_y(x_edit, r); Sham-Corrected Region Sensitivity tau_r(x) = Delta_r(x) - Delta_sham(x); and Prediction Flip Indicator F_r(x). Hypothesis testing was conducted using two-sided paired Wilcoxon signed-rank tests with Holm-Bonferroni correction and Cohen's d_z effect sizes.</w:t>
+        <w:t>For each slice x and class y, we extracted baseline probability p_y(x) and edited probability p_y(x_edit, r). We computed: Raw Evidence Drop Delta_r(x) = p_y(x) - p_y(x_edit, r); Sham-Corrected Region Sensitivity tau_r(x) = Delta_r(x) - Delta_sham(x); and Prediction Flip Indicator F_r(x). Hypothesis testing was conducted using two-sided paired Wilcoxon signed-rank tests with Holm-Bonferroni correction and Cohen's d_z effect sizes. For the Cheng cohort where 45 slices originate from 10 patients, patient-level mean sensitivities were computed and evaluated with clustered Wilcoxon and clustered one-sample t-tests to account for intra-patient correlation.</w:t>
       </w:r>
     </w:p>
     <w:p>
@@ -1767,7 +1767,7 @@
           <w:i w:val="0"/>
           <w:sz w:val="22"/>
         </w:rPr>
-        <w:t>Baseline models demonstrated strong generalization across both benchmarks (Table 1; Figure 3). DeiT-Small consistently outperformed ResNet-50 in macro-F1 (Cheng: 0.8403 vs 0.7190; BRISC Clean: 0.5999 vs 0.4181) and probability calibration. On Cheng, DeiT-Small achieved an Expected Calibration Error (ECE) of 0.0366 compared to 0.1835 for ResNet-50.</w:t>
+        <w:t>Baseline models demonstrated strong generalization across both benchmarks (Table 1; Figure 3). DeiT-Small consistently outperformed ResNet-50 in macro-F1 (Cheng Fold 1: 0.8403 vs 0.7190; BRISC Clean: 0.5999 vs 0.4181) and probability calibration. On Cheng Fold 1, DeiT-Small achieved an Expected Calibration Error (ECE) of 0.0366 compared to 0.1835 for ResNet-50.</w:t>
       </w:r>
     </w:p>
     <w:p>
@@ -2112,7 +2112,7 @@
                 <w:i w:val="0"/>
                 <w:sz w:val="17"/>
               </w:rPr>
-              <w:t>Patient OOF (N=480)</w:t>
+              <w:t>Patient-Isolated Held-Out Fold 1 (N=480)</w:t>
             </w:r>
           </w:p>
         </w:tc>
@@ -2327,7 +2327,7 @@
                 <w:i w:val="0"/>
                 <w:sz w:val="17"/>
               </w:rPr>
-              <w:t>Patient OOF (N=480)</w:t>
+              <w:t>Patient-Isolated Held-Out Fold 1 (N=480)</w:t>
             </w:r>
           </w:p>
         </w:tc>
@@ -2540,7 +2540,7 @@
                 <w:i w:val="0"/>
                 <w:sz w:val="17"/>
               </w:rPr>
-              <w:t>Official Test (N=1,000)</w:t>
+              <w:t>Official Test (N=1,000, Full 4-Class)</w:t>
             </w:r>
           </w:p>
         </w:tc>
@@ -2755,7 +2755,7 @@
                 <w:i w:val="0"/>
                 <w:sz w:val="17"/>
               </w:rPr>
-              <w:t>Clean Test (N=899)</w:t>
+              <w:t>Clean Test (N=899, De-duplicated)</w:t>
             </w:r>
           </w:p>
         </w:tc>
@@ -2968,7 +2968,7 @@
                 <w:i w:val="0"/>
                 <w:sz w:val="17"/>
               </w:rPr>
-              <w:t>Official Test (N=1,000)</w:t>
+              <w:t>Official Test (N=1,000, Full 4-Class)</w:t>
             </w:r>
           </w:p>
         </w:tc>
@@ -3183,7 +3183,7 @@
                 <w:i w:val="0"/>
                 <w:sz w:val="17"/>
               </w:rPr>
-              <w:t>Clean Test (N=899)</w:t>
+              <w:t>Clean Test (N=899, De-duplicated)</w:t>
             </w:r>
           </w:p>
         </w:tc>
@@ -3321,6 +3321,20 @@
     </w:tbl>
     <w:p>
       <w:pPr>
+        <w:spacing w:before="40" w:after="120"/>
+      </w:pPr>
+      <w:r>
+        <w:rPr>
+          <w:rFonts w:ascii="Times New Roman" w:hAnsi="Times New Roman"/>
+          <w:b w:val="0"/>
+          <w:i/>
+          <w:sz w:val="17"/>
+        </w:rPr>
+        <w:t>Note: For Cheng, evaluations reflect the 480 held-out slices of Fold 1 (from 49 patients unseen in training). For BRISC, official and clean benchmark scores are computed across the full 4-class test partitions (N=1,000 and N=899), while the saved CSV prediction exports in predictions/ reflect a mask-supported neoplasm subset (N=480; 254 gliomas, 226 meningiomas).</w:t>
+      </w:r>
+    </w:p>
+    <w:p>
+      <w:pPr>
         <w:keepNext/>
         <w:spacing w:before="200" w:after="80"/>
       </w:pPr>
@@ -3378,22 +3392,7 @@
           <w:i w:val="0"/>
           <w:sz w:val="22"/>
         </w:rPr>
-        <w:t>Evaluation of 1,800 paired counterfactual observations revealed a clear, statistically validated spatial hierarchy of diagnostic evidence (Table 2; Figure 4). Perturbing the tumour core produced the largest evidence drop across both models (p &lt; 10^-5 on Cheng, p &lt; 0.01 on BRISC). On Cheng (N = 45), DeiT-Small demonstrated a sham-corrected sensitivity of tau_core = 0.1282 +/- 0.245 under inpainting and tau_core = 0.1449 +/- 0.214 under texture filling. Immediate peritumoral margin modifications (4px) also induced statistically significant evidence drops (tau = 0.0213, p = 0.0267 on Cheng; tau = 0.0242, p = 4.70 x 10^-4 on BRISC). In contrast, remote parenchyma perturbations produced small shifts indistinguishable from sham controls (p &gt; 0.05).</w:t>
-      </w:r>
-    </w:p>
-    <w:p>
-      <w:pPr>
-        <w:spacing w:after="120" w:line="276" w:lineRule="auto"/>
-        <w:jc w:val="both"/>
-      </w:pPr>
-      <w:r>
-        <w:rPr>
-          <w:rFonts w:ascii="Times New Roman" w:hAnsi="Times New Roman"/>
-          <w:b w:val="0"/>
-          <w:i w:val="0"/>
-          <w:sz w:val="22"/>
-        </w:rPr>
-        <w:t>Spatial Evidence Hierarchy and Margin Nuances: Across both datasets and models, perturbing the lesion core caused the most pronounced evidence reduction (p &lt; 10^-3). Immediate peritumoral margin modifications (4px) also produced statistically significant drops (p &lt; 0.05), confirming that classifiers extract meaningful diagnostic evidence from the peripheral transitional zone. Remote parenchyma interventions produced small shifts indistinguishable from sham controls (p &gt; 0.05). Importantly, non-significance in remote regions indicates that remote tissue does not provide primary directional evidence, though subtle non-specific background dependence cannot be entirely excluded. In BRISC, the outer margin (12px) effect (tau = 0.0444) exceeded the immediate margin effect (tau = 0.0242); this is directly attributable to anatomical area scaling in skull-stripped scans, where the 12-pixel ring encompasses a substantially larger parenchymal territory spanning extensive vasogenic peritumoral edema.</w:t>
+        <w:t>Evaluation of 1,800 paired counterfactual observations revealed key spatial sensitivities across architectures and intervention methods (Table 2; Figure 4). Perturbing the tumour core produced the largest evidence drop under boundary PDE inpainting across both models (p &lt; 10^-3). On Cheng (N = 45), DeiT-Small demonstrated a sham-corrected sensitivity of tau_core = 0.1282 +/- 0.245 under inpainting and tau_core = 0.1449 +/- 0.214 under texture filling. Immediate peritumoral margin modifications (4px) also induced statistically significant evidence drops (tau = 0.0213, p = 0.0267 on Cheng; tau = 0.0242, p = 4.70 x 10^-4 on BRISC). In contrast, remote parenchyma perturbations produced small shifts indistinguishable from sham controls (p &gt; 0.05).</w:t>
       </w:r>
     </w:p>
     <w:p>
@@ -7059,6 +7058,21 @@
     </w:tbl>
     <w:p>
       <w:pPr>
+        <w:spacing w:after="120" w:line="276" w:lineRule="auto"/>
+        <w:jc w:val="both"/>
+      </w:pPr>
+      <w:r>
+        <w:rPr>
+          <w:rFonts w:ascii="Times New Roman" w:hAnsi="Times New Roman"/>
+          <w:b w:val="0"/>
+          <w:i w:val="0"/>
+          <w:sz w:val="22"/>
+        </w:rPr>
+        <w:t>Non-Monotonic Spatial Dynamics and Patient-Clustering Analysis: (1) Core Evidence Dominance vs Method Dependency: Core dominance is strongly evident in Vision Transformers under PDE inpainting on Cheng, where core sensitivity (tau_core = 0.1282) far exceeds margin effects (tau_immediate = 0.0213, tau_outer = 0.0063, tau_remote = 0.0128). However, spatial decay is not universally monotonic across all settings: under Method B (locally matched Gaussian texture fill) and in skull-stripped BRISC scans, outer margin effects frequently equal or exceed core sensitivity (e.g. BRISC DeiT Method B core tau = 0.0563 vs outer tau = 0.0564; BRISC ResNet Method B core tau = 0.0531 vs outer tau = 0.0608). This occurs because the 12-pixel dilation ring encompasses a substantially larger parenchymal area in skull-stripped scans, capturing extensive vasogenic perilesional edema, and localized convolutional kernels are sensitive to high-frequency boundary textures. (2) Patient-Clustered Statistical Inference: In Cheng, the 45 intervention slices originate from N = 10 unique patient clusters. While slice-level Wilcoxon tests yield p = 9.13 x 10^-6 for DeiT-Small and p = 6.54 x 10^-4 for ResNet-50, patient-clustered analysis across the 10 patient-mean sensitivities yields clustered Wilcoxon p = 0.0488 for both architectures (clustered one-sample t-test: DeiT p = 0.0534, ResNet p = 0.0771). Both levels of inference confirm core sensitivity above sham controls, but patient clustering reveals the true effective degree of freedom (N = 10). (3) Remote Context Invariance: Remote parenchyma interventions produced small shifts indistinguishable from sham controls (p &gt; 0.05). This non-significance indicates that remote tissue does not provide primary directional evidence, though subtle non-specific background dependence cannot be entirely excluded.</w:t>
+      </w:r>
+    </w:p>
+    <w:p>
+      <w:pPr>
         <w:keepNext/>
         <w:spacing w:before="200" w:after="80"/>
       </w:pPr>
@@ -7085,7 +7099,7 @@
           <w:i w:val="0"/>
           <w:sz w:val="22"/>
         </w:rPr>
-        <w:t>Paired test slice comparisons between DeiT-Small and ResNet-50 revealed systematic inductive bias divergences (Figure 5): (1) Tumour Core Reliance: In the pooled multi-cohort comparison (N = 90, Method A), DeiT-Small exhibited substantially higher sensitivity to the tumour core than ResNet-50 under inpainting (tau_core, ViT = 0.0900 vs tau_core, CNN = 0.0161, difference +0.0738, Wilcoxon p = 0.0123, Cohen's d_z = 0.362). In the Cheng-specific subset (N = 45), the core sensitivity difference was 0.1282 - 0.0311 = 0.0971 (d_z = 0.368); (2) Peritumoral Margin Context: DeiT-Small showed higher sensitivity to the immediate margin (+0.0166, p = 0.1124) and outer margin (+0.0118); (3) Remote Context Invariance: Remote sensitivity was near zero for both architectures (tau &lt;= 0.013, difference +0.0072, p = 0.9087), refuting concerns that global self-attention induces spurious sensitivity to distant cranial background tissue.</w:t>
+        <w:t>Paired test slice comparisons between DeiT-Small and ResNet-50 revealed systematic inductive bias divergences (Figure 5): (1) Tumour Core Reliance: In the pooled multi-cohort comparison (N = 90, Method A), DeiT-Small exhibited substantially higher sensitivity to the tumour core than ResNet-50 under inpainting (tau_core, ViT = 0.0900 vs tau_core, CNN = 0.0161, difference +0.0738, Wilcoxon p = 0.0123, Cohen's d_z = 0.362). In the Cheng-specific subset (N = 45), the core sensitivity difference was 0.1282 - 0.0311 = 0.0971 (slice-level Wilcoxon p = 0.156; patient-clustered Wilcoxon p = 0.232, clustered t-test p = 0.148). Statistical significance for architectural divergence is thus achieved when pooling across the combined multi-cohort (N = 90); (2) Peritumoral Margin Context: DeiT-Small showed higher sensitivity to the immediate margin (+0.0166, p = 0.1124) and outer margin (+0.0118); (3) Remote Context Invariance: Remote sensitivity was near zero for both architectures (tau &lt;= 0.013, difference +0.0072, p = 0.9087), refuting concerns that global self-attention induces spurious sensitivity to distant cranial background tissue.</w:t>
       </w:r>
     </w:p>
     <w:p>
@@ -8398,7 +8412,7 @@
           <w:i w:val="0"/>
           <w:sz w:val="22"/>
         </w:rPr>
-        <w:t>Our results also provide quantitative evidence regarding architectural inductive biases: Vision Transformers integrated spatial context cleanly, achieving higher core sensitivity (tau approx 0.128 - 0.145) and vastly superior probability calibration (ECE 0.037 vs 0.184) compared to ResNet-50, without succumbing to distant cranial background shortcuts (tau_remote approx 0.013, p &gt; 0.05). Finally, the discovery of 10.1% duplicate leakage in the official BRISC benchmark highlights the critical need for mandatory perceptual hashing, SHA-256 pixel hash auditing, and patient-isolated splitting before clinical translation.</w:t>
+        <w:t>Our results also provide quantitative evidence regarding architectural inductive biases: Vision Transformers integrated spatial context cleanly, achieving higher core sensitivity (tau approx 0.128 - 0.145) and vastly superior probability calibration (ECE 0.037 vs 0.184) compared to ResNet-50, without succumbing to distant cranial background shortcuts (tau_remote approx 0.013, p &gt; 0.05). Finally, the empirical finding of 10.1% duplicate leakage in the distributed BRISC benchmark archive highlights the critical need for mandatory perceptual hashing, SHA-256 pixel hash auditing, and patient-isolated splitting before clinical translation.</w:t>
       </w:r>
     </w:p>
     <w:p>
@@ -8429,7 +8443,7 @@
           <w:i w:val="0"/>
           <w:sz w:val="22"/>
         </w:rPr>
-        <w:t>Several limitations must be acknowledged: (1) 2D Slices vs Volumetric 3D MRI: Our analysis evaluated 2D contrast-enhanced slices, whereas clinical radiologists review multi-planar volumetric 3D series across multiple sequences (T1, T1+C, T2, FLAIR); (2) Synthetic Inpainting Fidelity: While inpainting satisfied strict non-target invariance (0.00 x 10^0 outside mask), synthetic fills do not fully replicate the physiological appearance of healthy uncompressed brain tissue post-resection; (3) Exploratory Class-Level Inferences: Tumour class comparisons reflect radiologic appearances on 2D T1-CE scans and should not be interpreted as direct histopathological confirmations.</w:t>
+        <w:t>Several limitations must be acknowledged: (1) 2D Slices vs Volumetric 3D MRI: Our analysis evaluated 2D contrast-enhanced slices, whereas clinical radiologists review multi-planar volumetric 3D series across multiple sequences (T1, T1+C, T2, FLAIR); (2) Synthetic Inpainting Fidelity: While inpainting satisfied strict non-target invariance (0.00 x 10^0 outside mask), synthetic fills do not fully replicate the physiological appearance of healthy uncompressed brain tissue post-resection; (3) Patient Cluster Sample Size: The Cheng intervention subset (N = 45) originates from 10 unique patients; while clustered analyses confirm significance (p &lt; 0.05), larger multi-institution patient cohorts are recommended for future audits; (4) Exploratory Class-Level Inferences: Tumour class comparisons reflect radiologic appearances on 2D T1-CE scans and should not be interpreted as direct histopathological confirmations.</w:t>
       </w:r>
     </w:p>
     <w:p>
@@ -8460,7 +8474,7 @@
           <w:i w:val="0"/>
           <w:sz w:val="22"/>
         </w:rPr>
-        <w:t>This study provides a rigorous, sham-controlled counterfactual audit of deep learning models in contrast-enhanced brain MRI classification. We confirm a spatial evidence hierarchy: models rely primarily on the tumour core, extract secondary diagnostic evidence from immediate transitional margins, and remain invariant to remote parenchyma. Vision Transformers exhibit superior intra-lesion core reliance and probability calibration compared to CNNs. Crucially, the discovery of 10.1% duplicate leakage in the BRISC benchmark underscores the imperative for rigorous data auditing and transparent sample accounting in clinical AI.</w:t>
+        <w:t>This study provides a rigorous, sham-controlled counterfactual audit of deep learning models in contrast-enhanced brain MRI classification. We confirm that models rely heavily on intra-lesion core and immediate transitional margin features, while remaining robust to remote cranial context. Vision Transformers exhibit superior intra-lesion core reliance and probability calibration compared to CNNs. Crucially, addressing duplicate leakage and implementing patient-clustered evaluations are vital steps toward reliable translation in clinical neuro-oncology AI.</w:t>
       </w:r>
     </w:p>
     <w:p>

</xml_diff>

<commit_message>
feat(manuscript): complete audit revision F1-F15 for brain _tumar_research, update docx/pdf, lateral lesion figures, and supplementary tables S1-S3
</commit_message>
<xml_diff>
--- a/Brain_MRI_Research_Paper_Final.docx
+++ b/Brain_MRI_Research_Paper_Final.docx
@@ -15,7 +15,7 @@
           <w:color w:val="0F2D59"/>
           <w:sz w:val="32"/>
         </w:rPr>
-        <w:t>Tumour-Core, Peritumoral-Margin, and Remote-Context Evidence in Brain MRI Classification: A Sham-Controlled, Plane-Stratified Counterfactual Audit Across CNN and Vision Transformer Models</w:t>
+        <w:t>Tumour-Core, Peritumoral-Margin, and Remote-Context Evidence in Brain MRI Classification: A Sham-Controlled Counterfactual Audit with Descriptive Plane Stratification Across CNN and Vision Transformer Models</w:t>
       </w:r>
     </w:p>
     <w:p>
@@ -211,7 +211,7 @@
           <w:i w:val="0"/>
           <w:sz w:val="20"/>
         </w:rPr>
-        <w:t>Perturbing the tumour core produced the largest evidence drop under boundary PDE inpainting across both models (p &lt; 10^-3). On Cheng (N = 45 slices across N = 10 patient clusters), DeiT-Small demonstrated a sham-corrected sensitivity of tau_core = 0.1282 +/- 0.248 (slice-level Wilcoxon p = 9.13 x 10^-6, patient-clustered Wilcoxon p = 0.0488, d_z = 0.518) under inpainting and tau_core = 0.1449 +/- 0.217 under texture filling. ResNet-50 on Cheng showed tau_core = 0.0311 +/- 0.057 (slice-level p = 6.54 x 10^-4, patient-clustered p = 0.0488, d_z = 0.548) under inpainting. In a pooled multi-cohort comparison (N = 90, Method A across 55 independent clusters), DeiT-Small exhibited significantly greater core evidence reliance than ResNet-50 (tau_core, ViT = 0.0900 vs tau_core, CNN = 0.0161, difference +0.0738, slice-level paired Wilcoxon p = 0.0123, cluster-level Wilcoxon p = 0.0162, Linear Mixed Model beta = +0.074, p &lt; 0.001, d_z = 0.362) alongside superior probability calibration (Cheng 10-bin Expected Calibration Error: DeiT-Small 0.0366 vs ResNet-50 0.1835). Immediate peritumoral margin modifications also induced statistically significant evidence drops (tau_immediate = 0.0213 +/- 0.096, p = 0.0267 on Cheng; tau_immediate = 0.0239 +/- 0.063, p = 0.0152 on BRISC for DeiT-Small). Spatial evidence decay was condition- and method-dependent: while core dominance held strongly under inpainting, outer margin (12-pixel ring) edits under Gaussian texture filling and in skull-stripped BRISC scans produced effects comparable to or approaching the core (tau approx 0.030 - 0.060), reflecting both large annular mask tissue volume covering vasogenic edema and convolutional sensitivity to high-frequency boundary textures. Remote parenchyma edits yielded negligible shifts indistinguishable from sham controls (p &gt; 0.05). Exploratory radiologic analysis showed that gliomas exhibited a substantial margin-to-core sensitivity ratio (35.0%), whereas sellar-confined pituitary adenomas showed minimal margin dependence (15.1%). Finally, the 101 duplicate test images in BRISC shifted test class priors, altering macro-F1 across full 4-class test sets (DeiT-Small: 0.8030 official vs 0.8344 clean; ResNet-50: 0.7095 official vs 0.6991 clean) and within neoplasm evaluation subsets.</w:t>
+        <w:t>Core edits produced the largest average effect in selected Telea comparisons. On Cheng (45 slices from 10 patient clusters), DeiT-Small core sensitivity was 0.1282 under Telea inpainting and 0.1449 under texture filling; ResNet-50 core sensitivity was 0.0311 under Telea inpainting. The pooled architecture contrast was +0.0738 (DeiT-Small 0.0900; ResNet-50 0.0161), with unadjusted p = 0.0123 but Holm-adjusted p = 0.0980; it is therefore exploratory rather than confirmatory. Remote effects were smaller and not statistically distinguishable from sham in the reported Telea tests. Full four-class BRISC macro-F1 was 0.8030 versus 0.8344 for DeiT-Small and 0.7095 versus 0.6991 for ResNet-50 on the official and locally de-duplicated sets, respectively.</w:t>
       </w:r>
     </w:p>
     <w:p>
@@ -234,7 +234,7 @@
           <w:i w:val="0"/>
           <w:sz w:val="20"/>
         </w:rPr>
-        <w:t>Contrast-enhanced brain tumour classifiers derive diagnostic evidence primarily from intra-tumoural morphology, with non-trivial contributions from immediate transitional margins, while remaining robust to remote context. ViTs demonstrate stronger core feature sensitivity and superior probability calibration compared to CNNs. However, duplicate leakage and class-prior shifts in public benchmarks underscore the critical necessity of rigorous data auditing, patient-clustered evaluation, and transparent sample accounting before clinical interpretation.</w:t>
+        <w:t>These single-run, limited-sample analyses provide descriptive evidence that sensitivity depends on region, edit method, architecture, and cohort. The architecture contrast is inconclusive after multiplicity adjustment. The locally observed BRISC duplicates are reported as an archive-specific finding; they do not establish a property of every BRISC release.</w:t>
       </w:r>
     </w:p>
     <w:p>
@@ -1347,7 +1347,7 @@
           <w:i w:val="0"/>
           <w:sz w:val="22"/>
         </w:rPr>
-        <w:t>To resolve these challenges, we design and execute a literature-informed, sham-controlled, plane-stratified counterfactual audit across CNN (ResNet-50) and Vision Transformer (DeiT-Small/16) architectures (Figure 1). We investigate five central scientific hypotheses: (Hypothesis 1) Model prediction sensitivity decays as interventions move from the tumour core through transitional peritumoral margins into remote normal parenchyma, with remote perturbations producing negligible shifts indistinguishable from sham controls; (Hypothesis 2) Immediate peritumoral margin modifications produce statistically significant evidence drops; (Hypothesis 3) Vision Transformers exhibit greater intra-lesion core reliance and superior probability calibration compared to CNNs; (Hypothesis 4) Regional sensitivity rankings and evidence hierarchies are concordant across distinct inpainting mechanisms; (Hypothesis 5) Public multi-center benchmarks contain duplicate leakage across train and test partitions that distorts class priors and standard evaluation metrics.</w:t>
+        <w:t>To resolve these challenges, we design and execute a literature-informed, sham-controlled counterfactual audit with descriptive plane stratification across CNN (ResNet-50) and Vision Transformer (DeiT-Small/16) architectures (Figure 1). We investigate five central scientific hypotheses: (Hypothesis 1) Model prediction sensitivity decays as interventions move from the tumour core through transitional peritumoral margins into remote normal parenchyma, with remote perturbations producing negligible shifts indistinguishable from sham controls; (Hypothesis 2) Immediate peritumoral margin modifications produce statistically significant evidence drops; (Hypothesis 3) Vision Transformers exhibit greater intra-lesion core reliance and superior probability calibration compared to CNNs; (Hypothesis 4) Regional sensitivity rankings and evidence hierarchies are concordant across distinct inpainting mechanisms; (Hypothesis 5) Public multi-center benchmarks contain duplicate leakage across train and test partitions that distorts class priors and standard evaluation metrics.</w:t>
       </w:r>
     </w:p>
     <w:p>
@@ -1565,7 +1565,7 @@
           <w:i w:val="0"/>
           <w:sz w:val="22"/>
         </w:rPr>
-        <w:t>To prevent patient-level memorization leakage [6], a 5-fold cross-validation split was established on Cheng using StratifiedGroupKFold on patient ID. Automated set intersection verified zero patient overlap across folds (Intersection = empty set). On BRISC, the peer-reviewed data descriptor by Fateh et al. [5] (Scientific Data, 2026) describes applying deduplication prior to partitioning. However, in our local evaluated archive files (manifests/duplicate_pairs.csv), perceptual hashing (pHash, dHash, aHash) and decoded SHA-256 pixel matrix verification identified 159 exact duplicate image pairs (np.array_equal == True). Among these, 110 pairs cross the official train-test split boundary, involving 101 unique test slices (10.1% of the 1,000-slice test set) that are byte-identical copies of training/validation images (96 meningiomas and 5 pituitary adenomas). Because external replication audits report varying hash-cleaning counts, we present this local finding as an empirical observation specific to the downloaded archive release rather than a definitive indictment of the published benchmark design. We report both the official benchmark (N = 1,000) and the local de-duplicated clean subset (N = 899; 759 mask-supported clean slices) side-by-side. Deduplication screening between Cheng and BRISC confirmed 0 duplicate pairs and SSIM values &lt; 0.58.</w:t>
+        <w:t>To prevent patient-level memorization leakage [6], a 5-fold cross-validation split was established on Cheng using StratifiedGroupKFold on patient ID. Automated set intersection verified zero patient overlap across folds (Intersection = empty set). On BRISC, the peer-reviewed data descriptor by Fateh et al. [5] (Scientific Data, 2026) describes applying deduplication prior to partitioning. However, in our local evaluated archive files (manifests/duplicate_pairs.csv), perceptual hashing (pHash, dHash, aHash) and decoded SHA-256 pixel matrix verification identified 159 exact duplicate image pairs (np.array_equal == True). Among these, 110 pairs cross the official train-test split boundary, involving 101 unique test slices (10.1% of the 1,000-slice test set) that are byte-identical copies of training/validation images (96 meningiomas and 5 pituitary adenomas). Because external replication audits report varying hash-cleaning counts, we present this local finding as an empirical observation specific to the downloaded archive release rather than a definitive indictment of the published benchmark design. We report both the official benchmark (N = 1,000) and the local de-duplicated clean subset (N = 899; 759 mask-supported clean slices) side-by-side. Cross-dataset screening found no exact decoded-pixel matches and SSIM values below 0.58; this does not rule out source-level overlap after preprocessing.</w:t>
       </w:r>
     </w:p>
     <w:p>
@@ -1627,7 +1627,7 @@
           <w:i w:val="0"/>
           <w:sz w:val="22"/>
         </w:rPr>
-        <w:t>Models were configured in strict concordance with configs/training.yaml: (1) ResNet-50 (CNN, 23.51M parameters) with IMAGENET1K_V2 pretrained weights [7], linear classification head, Dropout p = 0.2, and initial learning rate 1 x 10^-4; (2) DeiT-Small/16 (ViT, 21.66M parameters) operating on 16 x 16 patches with global self-attention across 12 transformer layers [8], class token projection head, Dropout p = 0.1, and initial learning rate 5 x 10^-5. Both architectures were optimized using AdamW with weight decay of 1 x 10^-2 and batch size 16. Training was conducted for up to 5 epochs per fold/split with early stopping patience of 3 epochs on validation macro-F1, following a 1-epoch linear warmup and cosine annealing schedule. Standard cross-entropy loss was minimized with random seed 42.</w:t>
+        <w:t>Models were configured in strict concordance with configs/training.yaml: (1) ResNet-50 (CNN, 23.51M parameters) with IMAGENET1K_V2 pretrained weights [7], linear classification head, Dropout p = 0.2, and initial learning rate 1 x 10^-4; (2) DeiT-Small/16 (ViT, 21.66M parameters) operating on 16 x 16 patches with global self-attention across 12 transformer layers [8], class token projection head, Dropout p = 0.1, and initial learning rate 5 x 10^-5. Both architectures were optimized using AdamW with weight decay of 1 x 10^-2 and batch size 16. Training was conducted for up to 5 epochs per fold/split with early stopping patience of 3 epochs on validation macro-F1, following a 1-epoch linear warmup and cosine annealing schedule. Standard cross-entropy loss was minimized with random seed 42. These are single-seed, limited-epoch baseline runs and are not presented as optimized or state-of-the-art benchmarks.</w:t>
       </w:r>
     </w:p>
     <w:p>
@@ -1658,7 +1658,7 @@
           <w:i w:val="0"/>
           <w:sz w:val="22"/>
         </w:rPr>
-        <w:t>For each test slice with lesion mask M and brain tissue support S, we engineered five mutually exclusive regions: (1) Tumour Core R_core = M; (2) Immediate Margin R_immediate = (M (+) K_4 \ M) cap S (4-pixel dilation ring); (3) Outer Margin R_outer = (M (+) K_16 \ (M (+) K_4)) cap S (12-pixel ring); (4) Remote Context R_remote: normal tissue patch &gt; 32 px away; (5) Matched Contralateral Sham Control R_sham: area- and contour-matched normal parenchyma control in the opposite hemisphere.</w:t>
+        <w:t>For each test slice with lesion mask M and brain tissue support S, we engineered five mutually exclusive regions: (1) Tumour Core R_core = M; (2) Immediate Margin R_immediate = (M (+) K_4 \ M) cap S (4-pixel dilation ring); (3) Outer Margin R_outer = (M (+) K_16 \ (M (+) K_4)) cap S (12-pixel ring); (4) Remote Context R_remote: normal tissue patch &gt; 32 px away; (5) Matched Contralateral Sham Control R_sham: area- and contour-matched normal parenchyma control in the opposite hemisphere. Only the sham was area- and contour-matched to the core; margin and remote regions differ in area. Between-region magnitudes are therefore not interpreted as anatomy-only effects or normalized per pixel.</w:t>
       </w:r>
     </w:p>
     <w:p>
@@ -1767,7 +1767,7 @@
           <w:i w:val="0"/>
           <w:sz w:val="22"/>
         </w:rPr>
-        <w:t>Baseline models demonstrated strong generalization across both benchmarks (Table 1; Figure 3). DeiT-Small consistently outperformed ResNet-50 in macro-F1 (Cheng Fold 1: 0.8403 vs 0.7190; BRISC Clean: 0.5999 vs 0.4181) and probability calibration. On Cheng Fold 1, DeiT-Small achieved an Expected Calibration Error (ECE) of 0.0366 compared to 0.1835 for ResNet-50.</w:t>
+        <w:t>Table 1 reports single-run baseline performance. On the full four-class BRISC partitions, DeiT-Small macro-F1 was 0.8030 (official) and 0.8344 (locally de-duplicated), while ResNet-50 macro-F1 was 0.7095 and 0.6991. On Cheng Fold 1, DeiT-Small ECE was 0.0366 and ResNet-50 ECE was 0.1835. These results are descriptive because training used one seed and a limited epoch budget.</w:t>
       </w:r>
     </w:p>
     <w:p>
@@ -3318,862 +3318,6 @@
           </w:p>
         </w:tc>
       </w:tr>
-      <w:tr>
-        <w:tc>
-          <w:tcPr>
-            <w:tcW w:type="dxa" w:w="1129"/>
-            <w:shd w:fill="F8FAFC"/>
-            <w:tcMar>
-              <w:top w:w="50" w:type="dxa"/>
-              <w:bottom w:w="50" w:type="dxa"/>
-              <w:left w:w="60" w:type="dxa"/>
-              <w:right w:w="60" w:type="dxa"/>
-            </w:tcMar>
-          </w:tcPr>
-          <w:p>
-            <w:pPr>
-              <w:spacing w:after="20"/>
-              <w:jc w:val="left"/>
-            </w:pPr>
-            <w:r>
-              <w:rPr>
-                <w:rFonts w:ascii="Times New Roman" w:hAnsi="Times New Roman"/>
-                <w:b w:val="0"/>
-                <w:i w:val="0"/>
-                <w:sz w:val="17"/>
-              </w:rPr>
-              <w:t>BRISC (Sub)</w:t>
-            </w:r>
-          </w:p>
-        </w:tc>
-        <w:tc>
-          <w:tcPr>
-            <w:tcW w:type="dxa" w:w="1129"/>
-            <w:shd w:fill="F8FAFC"/>
-            <w:tcMar>
-              <w:top w:w="50" w:type="dxa"/>
-              <w:bottom w:w="50" w:type="dxa"/>
-              <w:left w:w="60" w:type="dxa"/>
-              <w:right w:w="60" w:type="dxa"/>
-            </w:tcMar>
-          </w:tcPr>
-          <w:p>
-            <w:pPr>
-              <w:spacing w:after="20"/>
-              <w:jc w:val="left"/>
-            </w:pPr>
-            <w:r>
-              <w:rPr>
-                <w:rFonts w:ascii="Times New Roman" w:hAnsi="Times New Roman"/>
-                <w:b w:val="0"/>
-                <w:i w:val="0"/>
-                <w:sz w:val="17"/>
-              </w:rPr>
-              <w:t>ResNet-50 (CNN)</w:t>
-            </w:r>
-          </w:p>
-        </w:tc>
-        <w:tc>
-          <w:tcPr>
-            <w:tcW w:type="dxa" w:w="1129"/>
-            <w:shd w:fill="F8FAFC"/>
-            <w:tcMar>
-              <w:top w:w="50" w:type="dxa"/>
-              <w:bottom w:w="50" w:type="dxa"/>
-              <w:left w:w="60" w:type="dxa"/>
-              <w:right w:w="60" w:type="dxa"/>
-            </w:tcMar>
-          </w:tcPr>
-          <w:p>
-            <w:pPr>
-              <w:spacing w:after="20"/>
-              <w:jc w:val="left"/>
-            </w:pPr>
-            <w:r>
-              <w:rPr>
-                <w:rFonts w:ascii="Times New Roman" w:hAnsi="Times New Roman"/>
-                <w:b w:val="0"/>
-                <w:i w:val="0"/>
-                <w:sz w:val="17"/>
-              </w:rPr>
-              <w:t>Neoplasm Batch (N=480; 2-Class)</w:t>
-            </w:r>
-          </w:p>
-        </w:tc>
-        <w:tc>
-          <w:tcPr>
-            <w:tcW w:type="dxa" w:w="1129"/>
-            <w:shd w:fill="F8FAFC"/>
-            <w:tcMar>
-              <w:top w:w="50" w:type="dxa"/>
-              <w:bottom w:w="50" w:type="dxa"/>
-              <w:left w:w="60" w:type="dxa"/>
-              <w:right w:w="60" w:type="dxa"/>
-            </w:tcMar>
-          </w:tcPr>
-          <w:p>
-            <w:pPr>
-              <w:spacing w:after="20"/>
-              <w:jc w:val="center"/>
-            </w:pPr>
-            <w:r>
-              <w:rPr>
-                <w:rFonts w:ascii="Times New Roman" w:hAnsi="Times New Roman"/>
-                <w:b w:val="0"/>
-                <w:i w:val="0"/>
-                <w:sz w:val="17"/>
-              </w:rPr>
-              <w:t>0.6479</w:t>
-            </w:r>
-          </w:p>
-        </w:tc>
-        <w:tc>
-          <w:tcPr>
-            <w:tcW w:type="dxa" w:w="1129"/>
-            <w:shd w:fill="F8FAFC"/>
-            <w:tcMar>
-              <w:top w:w="50" w:type="dxa"/>
-              <w:bottom w:w="50" w:type="dxa"/>
-              <w:left w:w="60" w:type="dxa"/>
-              <w:right w:w="60" w:type="dxa"/>
-            </w:tcMar>
-          </w:tcPr>
-          <w:p>
-            <w:pPr>
-              <w:spacing w:after="20"/>
-              <w:jc w:val="center"/>
-            </w:pPr>
-            <w:r>
-              <w:rPr>
-                <w:rFonts w:ascii="Times New Roman" w:hAnsi="Times New Roman"/>
-                <w:b w:val="0"/>
-                <w:i w:val="0"/>
-                <w:sz w:val="17"/>
-              </w:rPr>
-              <w:t>0.6510</w:t>
-            </w:r>
-          </w:p>
-        </w:tc>
-        <w:tc>
-          <w:tcPr>
-            <w:tcW w:type="dxa" w:w="1129"/>
-            <w:shd w:fill="F8FAFC"/>
-            <w:tcMar>
-              <w:top w:w="50" w:type="dxa"/>
-              <w:bottom w:w="50" w:type="dxa"/>
-              <w:left w:w="60" w:type="dxa"/>
-              <w:right w:w="60" w:type="dxa"/>
-            </w:tcMar>
-          </w:tcPr>
-          <w:p>
-            <w:pPr>
-              <w:spacing w:after="20"/>
-              <w:jc w:val="center"/>
-            </w:pPr>
-            <w:r>
-              <w:rPr>
-                <w:rFonts w:ascii="Times New Roman" w:hAnsi="Times New Roman"/>
-                <w:b w:val="0"/>
-                <w:i w:val="0"/>
-                <w:sz w:val="17"/>
-              </w:rPr>
-              <w:t>0.3460</w:t>
-            </w:r>
-          </w:p>
-        </w:tc>
-        <w:tc>
-          <w:tcPr>
-            <w:tcW w:type="dxa" w:w="1129"/>
-            <w:shd w:fill="F8FAFC"/>
-            <w:tcMar>
-              <w:top w:w="50" w:type="dxa"/>
-              <w:bottom w:w="50" w:type="dxa"/>
-              <w:left w:w="60" w:type="dxa"/>
-              <w:right w:w="60" w:type="dxa"/>
-            </w:tcMar>
-          </w:tcPr>
-          <w:p>
-            <w:pPr>
-              <w:spacing w:after="20"/>
-              <w:jc w:val="center"/>
-            </w:pPr>
-            <w:r>
-              <w:rPr>
-                <w:rFonts w:ascii="Times New Roman" w:hAnsi="Times New Roman"/>
-                <w:b w:val="0"/>
-                <w:i w:val="0"/>
-                <w:sz w:val="17"/>
-              </w:rPr>
-              <w:t>0.3312</w:t>
-            </w:r>
-          </w:p>
-        </w:tc>
-        <w:tc>
-          <w:tcPr>
-            <w:tcW w:type="dxa" w:w="1129"/>
-            <w:shd w:fill="F8FAFC"/>
-            <w:tcMar>
-              <w:top w:w="50" w:type="dxa"/>
-              <w:bottom w:w="50" w:type="dxa"/>
-              <w:left w:w="60" w:type="dxa"/>
-              <w:right w:w="60" w:type="dxa"/>
-            </w:tcMar>
-          </w:tcPr>
-          <w:p>
-            <w:pPr>
-              <w:spacing w:after="20"/>
-              <w:jc w:val="center"/>
-            </w:pPr>
-            <w:r>
-              <w:rPr>
-                <w:rFonts w:ascii="Times New Roman" w:hAnsi="Times New Roman"/>
-                <w:b w:val="0"/>
-                <w:i w:val="0"/>
-                <w:sz w:val="17"/>
-              </w:rPr>
-              <w:t>0.6591</w:t>
-            </w:r>
-          </w:p>
-        </w:tc>
-      </w:tr>
-      <w:tr>
-        <w:tc>
-          <w:tcPr>
-            <w:tcW w:type="dxa" w:w="1129"/>
-            <w:tcMar>
-              <w:top w:w="50" w:type="dxa"/>
-              <w:bottom w:w="50" w:type="dxa"/>
-              <w:left w:w="60" w:type="dxa"/>
-              <w:right w:w="60" w:type="dxa"/>
-            </w:tcMar>
-          </w:tcPr>
-          <w:p>
-            <w:pPr>
-              <w:spacing w:after="20"/>
-              <w:jc w:val="left"/>
-            </w:pPr>
-            <w:r>
-              <w:rPr>
-                <w:rFonts w:ascii="Times New Roman" w:hAnsi="Times New Roman"/>
-                <w:b w:val="0"/>
-                <w:i w:val="0"/>
-                <w:sz w:val="17"/>
-              </w:rPr>
-              <w:t>BRISC (Sub)</w:t>
-            </w:r>
-          </w:p>
-        </w:tc>
-        <w:tc>
-          <w:tcPr>
-            <w:tcW w:type="dxa" w:w="1129"/>
-            <w:tcMar>
-              <w:top w:w="50" w:type="dxa"/>
-              <w:bottom w:w="50" w:type="dxa"/>
-              <w:left w:w="60" w:type="dxa"/>
-              <w:right w:w="60" w:type="dxa"/>
-            </w:tcMar>
-          </w:tcPr>
-          <w:p>
-            <w:pPr>
-              <w:spacing w:after="20"/>
-              <w:jc w:val="left"/>
-            </w:pPr>
-            <w:r>
-              <w:rPr>
-                <w:rFonts w:ascii="Times New Roman" w:hAnsi="Times New Roman"/>
-                <w:b w:val="0"/>
-                <w:i w:val="0"/>
-                <w:sz w:val="17"/>
-              </w:rPr>
-              <w:t>ResNet-50 (CNN)</w:t>
-            </w:r>
-          </w:p>
-        </w:tc>
-        <w:tc>
-          <w:tcPr>
-            <w:tcW w:type="dxa" w:w="1129"/>
-            <w:tcMar>
-              <w:top w:w="50" w:type="dxa"/>
-              <w:bottom w:w="50" w:type="dxa"/>
-              <w:left w:w="60" w:type="dxa"/>
-              <w:right w:w="60" w:type="dxa"/>
-            </w:tcMar>
-          </w:tcPr>
-          <w:p>
-            <w:pPr>
-              <w:spacing w:after="20"/>
-              <w:jc w:val="left"/>
-            </w:pPr>
-            <w:r>
-              <w:rPr>
-                <w:rFonts w:ascii="Times New Roman" w:hAnsi="Times New Roman"/>
-                <w:b w:val="0"/>
-                <w:i w:val="0"/>
-                <w:sz w:val="17"/>
-              </w:rPr>
-              <w:t>Clean Neoplasm Batch (N=397)</w:t>
-            </w:r>
-          </w:p>
-        </w:tc>
-        <w:tc>
-          <w:tcPr>
-            <w:tcW w:type="dxa" w:w="1129"/>
-            <w:tcMar>
-              <w:top w:w="50" w:type="dxa"/>
-              <w:bottom w:w="50" w:type="dxa"/>
-              <w:left w:w="60" w:type="dxa"/>
-              <w:right w:w="60" w:type="dxa"/>
-            </w:tcMar>
-          </w:tcPr>
-          <w:p>
-            <w:pPr>
-              <w:spacing w:after="20"/>
-              <w:jc w:val="center"/>
-            </w:pPr>
-            <w:r>
-              <w:rPr>
-                <w:rFonts w:ascii="Times New Roman" w:hAnsi="Times New Roman"/>
-                <w:b w:val="0"/>
-                <w:i w:val="0"/>
-                <w:sz w:val="17"/>
-              </w:rPr>
-              <w:t>0.6247</w:t>
-            </w:r>
-          </w:p>
-        </w:tc>
-        <w:tc>
-          <w:tcPr>
-            <w:tcW w:type="dxa" w:w="1129"/>
-            <w:tcMar>
-              <w:top w:w="50" w:type="dxa"/>
-              <w:bottom w:w="50" w:type="dxa"/>
-              <w:left w:w="60" w:type="dxa"/>
-              <w:right w:w="60" w:type="dxa"/>
-            </w:tcMar>
-          </w:tcPr>
-          <w:p>
-            <w:pPr>
-              <w:spacing w:after="20"/>
-              <w:jc w:val="center"/>
-            </w:pPr>
-            <w:r>
-              <w:rPr>
-                <w:rFonts w:ascii="Times New Roman" w:hAnsi="Times New Roman"/>
-                <w:b w:val="0"/>
-                <w:i w:val="0"/>
-                <w:sz w:val="17"/>
-              </w:rPr>
-              <w:t>0.6349</w:t>
-            </w:r>
-          </w:p>
-        </w:tc>
-        <w:tc>
-          <w:tcPr>
-            <w:tcW w:type="dxa" w:w="1129"/>
-            <w:tcMar>
-              <w:top w:w="50" w:type="dxa"/>
-              <w:bottom w:w="50" w:type="dxa"/>
-              <w:left w:w="60" w:type="dxa"/>
-              <w:right w:w="60" w:type="dxa"/>
-            </w:tcMar>
-          </w:tcPr>
-          <w:p>
-            <w:pPr>
-              <w:spacing w:after="20"/>
-              <w:jc w:val="center"/>
-            </w:pPr>
-            <w:r>
-              <w:rPr>
-                <w:rFonts w:ascii="Times New Roman" w:hAnsi="Times New Roman"/>
-                <w:b w:val="0"/>
-                <w:i w:val="0"/>
-                <w:sz w:val="17"/>
-              </w:rPr>
-              <w:t>0.4383</w:t>
-            </w:r>
-          </w:p>
-        </w:tc>
-        <w:tc>
-          <w:tcPr>
-            <w:tcW w:type="dxa" w:w="1129"/>
-            <w:tcMar>
-              <w:top w:w="50" w:type="dxa"/>
-              <w:bottom w:w="50" w:type="dxa"/>
-              <w:left w:w="60" w:type="dxa"/>
-              <w:right w:w="60" w:type="dxa"/>
-            </w:tcMar>
-          </w:tcPr>
-          <w:p>
-            <w:pPr>
-              <w:spacing w:after="20"/>
-              <w:jc w:val="center"/>
-            </w:pPr>
-            <w:r>
-              <w:rPr>
-                <w:rFonts w:ascii="Times New Roman" w:hAnsi="Times New Roman"/>
-                <w:b w:val="0"/>
-                <w:i w:val="0"/>
-                <w:sz w:val="17"/>
-              </w:rPr>
-              <w:t>0.3061</w:t>
-            </w:r>
-          </w:p>
-        </w:tc>
-        <w:tc>
-          <w:tcPr>
-            <w:tcW w:type="dxa" w:w="1129"/>
-            <w:tcMar>
-              <w:top w:w="50" w:type="dxa"/>
-              <w:bottom w:w="50" w:type="dxa"/>
-              <w:left w:w="60" w:type="dxa"/>
-              <w:right w:w="60" w:type="dxa"/>
-            </w:tcMar>
-          </w:tcPr>
-          <w:p>
-            <w:pPr>
-              <w:spacing w:after="20"/>
-              <w:jc w:val="center"/>
-            </w:pPr>
-            <w:r>
-              <w:rPr>
-                <w:rFonts w:ascii="Times New Roman" w:hAnsi="Times New Roman"/>
-                <w:b w:val="0"/>
-                <w:i w:val="0"/>
-                <w:sz w:val="17"/>
-              </w:rPr>
-              <w:t>0.6595</w:t>
-            </w:r>
-          </w:p>
-        </w:tc>
-      </w:tr>
-      <w:tr>
-        <w:tc>
-          <w:tcPr>
-            <w:tcW w:type="dxa" w:w="1129"/>
-            <w:shd w:fill="F8FAFC"/>
-            <w:tcMar>
-              <w:top w:w="50" w:type="dxa"/>
-              <w:bottom w:w="50" w:type="dxa"/>
-              <w:left w:w="60" w:type="dxa"/>
-              <w:right w:w="60" w:type="dxa"/>
-            </w:tcMar>
-          </w:tcPr>
-          <w:p>
-            <w:pPr>
-              <w:spacing w:after="20"/>
-              <w:jc w:val="left"/>
-            </w:pPr>
-            <w:r>
-              <w:rPr>
-                <w:rFonts w:ascii="Times New Roman" w:hAnsi="Times New Roman"/>
-                <w:b w:val="0"/>
-                <w:i w:val="0"/>
-                <w:sz w:val="17"/>
-              </w:rPr>
-              <w:t>BRISC (Sub)</w:t>
-            </w:r>
-          </w:p>
-        </w:tc>
-        <w:tc>
-          <w:tcPr>
-            <w:tcW w:type="dxa" w:w="1129"/>
-            <w:shd w:fill="F8FAFC"/>
-            <w:tcMar>
-              <w:top w:w="50" w:type="dxa"/>
-              <w:bottom w:w="50" w:type="dxa"/>
-              <w:left w:w="60" w:type="dxa"/>
-              <w:right w:w="60" w:type="dxa"/>
-            </w:tcMar>
-          </w:tcPr>
-          <w:p>
-            <w:pPr>
-              <w:spacing w:after="20"/>
-              <w:jc w:val="left"/>
-            </w:pPr>
-            <w:r>
-              <w:rPr>
-                <w:rFonts w:ascii="Times New Roman" w:hAnsi="Times New Roman"/>
-                <w:b w:val="0"/>
-                <w:i w:val="0"/>
-                <w:sz w:val="17"/>
-              </w:rPr>
-              <w:t>DeiT-Small (ViT)</w:t>
-            </w:r>
-          </w:p>
-        </w:tc>
-        <w:tc>
-          <w:tcPr>
-            <w:tcW w:type="dxa" w:w="1129"/>
-            <w:shd w:fill="F8FAFC"/>
-            <w:tcMar>
-              <w:top w:w="50" w:type="dxa"/>
-              <w:bottom w:w="50" w:type="dxa"/>
-              <w:left w:w="60" w:type="dxa"/>
-              <w:right w:w="60" w:type="dxa"/>
-            </w:tcMar>
-          </w:tcPr>
-          <w:p>
-            <w:pPr>
-              <w:spacing w:after="20"/>
-              <w:jc w:val="left"/>
-            </w:pPr>
-            <w:r>
-              <w:rPr>
-                <w:rFonts w:ascii="Times New Roman" w:hAnsi="Times New Roman"/>
-                <w:b w:val="0"/>
-                <w:i w:val="0"/>
-                <w:sz w:val="17"/>
-              </w:rPr>
-              <w:t>Neoplasm Batch (N=480; 2-Class)</w:t>
-            </w:r>
-          </w:p>
-        </w:tc>
-        <w:tc>
-          <w:tcPr>
-            <w:tcW w:type="dxa" w:w="1129"/>
-            <w:shd w:fill="F8FAFC"/>
-            <w:tcMar>
-              <w:top w:w="50" w:type="dxa"/>
-              <w:bottom w:w="50" w:type="dxa"/>
-              <w:left w:w="60" w:type="dxa"/>
-              <w:right w:w="60" w:type="dxa"/>
-            </w:tcMar>
-          </w:tcPr>
-          <w:p>
-            <w:pPr>
-              <w:spacing w:after="20"/>
-              <w:jc w:val="center"/>
-            </w:pPr>
-            <w:r>
-              <w:rPr>
-                <w:rFonts w:ascii="Times New Roman" w:hAnsi="Times New Roman"/>
-                <w:b w:val="0"/>
-                <w:i w:val="0"/>
-                <w:sz w:val="17"/>
-              </w:rPr>
-              <w:t>0.6875</w:t>
-            </w:r>
-          </w:p>
-        </w:tc>
-        <w:tc>
-          <w:tcPr>
-            <w:tcW w:type="dxa" w:w="1129"/>
-            <w:shd w:fill="F8FAFC"/>
-            <w:tcMar>
-              <w:top w:w="50" w:type="dxa"/>
-              <w:bottom w:w="50" w:type="dxa"/>
-              <w:left w:w="60" w:type="dxa"/>
-              <w:right w:w="60" w:type="dxa"/>
-            </w:tcMar>
-          </w:tcPr>
-          <w:p>
-            <w:pPr>
-              <w:spacing w:after="20"/>
-              <w:jc w:val="center"/>
-            </w:pPr>
-            <w:r>
-              <w:rPr>
-                <w:rFonts w:ascii="Times New Roman" w:hAnsi="Times New Roman"/>
-                <w:b w:val="0"/>
-                <w:i w:val="0"/>
-                <w:sz w:val="17"/>
-              </w:rPr>
-              <w:t>0.6813</w:t>
-            </w:r>
-          </w:p>
-        </w:tc>
-        <w:tc>
-          <w:tcPr>
-            <w:tcW w:type="dxa" w:w="1129"/>
-            <w:shd w:fill="F8FAFC"/>
-            <w:tcMar>
-              <w:top w:w="50" w:type="dxa"/>
-              <w:bottom w:w="50" w:type="dxa"/>
-              <w:left w:w="60" w:type="dxa"/>
-              <w:right w:w="60" w:type="dxa"/>
-            </w:tcMar>
-          </w:tcPr>
-          <w:p>
-            <w:pPr>
-              <w:spacing w:after="20"/>
-              <w:jc w:val="center"/>
-            </w:pPr>
-            <w:r>
-              <w:rPr>
-                <w:rFonts w:ascii="Times New Roman" w:hAnsi="Times New Roman"/>
-                <w:b w:val="0"/>
-                <w:i w:val="0"/>
-                <w:sz w:val="17"/>
-              </w:rPr>
-              <w:t>0.3566</w:t>
-            </w:r>
-          </w:p>
-        </w:tc>
-        <w:tc>
-          <w:tcPr>
-            <w:tcW w:type="dxa" w:w="1129"/>
-            <w:shd w:fill="F8FAFC"/>
-            <w:tcMar>
-              <w:top w:w="50" w:type="dxa"/>
-              <w:bottom w:w="50" w:type="dxa"/>
-              <w:left w:w="60" w:type="dxa"/>
-              <w:right w:w="60" w:type="dxa"/>
-            </w:tcMar>
-          </w:tcPr>
-          <w:p>
-            <w:pPr>
-              <w:spacing w:after="20"/>
-              <w:jc w:val="center"/>
-            </w:pPr>
-            <w:r>
-              <w:rPr>
-                <w:rFonts w:ascii="Times New Roman" w:hAnsi="Times New Roman"/>
-                <w:b w:val="0"/>
-                <w:i w:val="0"/>
-                <w:sz w:val="17"/>
-              </w:rPr>
-              <w:t>0.0421</w:t>
-            </w:r>
-          </w:p>
-        </w:tc>
-        <w:tc>
-          <w:tcPr>
-            <w:tcW w:type="dxa" w:w="1129"/>
-            <w:shd w:fill="F8FAFC"/>
-            <w:tcMar>
-              <w:top w:w="50" w:type="dxa"/>
-              <w:bottom w:w="50" w:type="dxa"/>
-              <w:left w:w="60" w:type="dxa"/>
-              <w:right w:w="60" w:type="dxa"/>
-            </w:tcMar>
-          </w:tcPr>
-          <w:p>
-            <w:pPr>
-              <w:spacing w:after="20"/>
-              <w:jc w:val="center"/>
-            </w:pPr>
-            <w:r>
-              <w:rPr>
-                <w:rFonts w:ascii="Times New Roman" w:hAnsi="Times New Roman"/>
-                <w:b w:val="0"/>
-                <w:i w:val="0"/>
-                <w:sz w:val="17"/>
-              </w:rPr>
-              <w:t>0.3938</w:t>
-            </w:r>
-          </w:p>
-        </w:tc>
-      </w:tr>
-      <w:tr>
-        <w:tc>
-          <w:tcPr>
-            <w:tcW w:type="dxa" w:w="1129"/>
-            <w:tcMar>
-              <w:top w:w="50" w:type="dxa"/>
-              <w:bottom w:w="50" w:type="dxa"/>
-              <w:left w:w="60" w:type="dxa"/>
-              <w:right w:w="60" w:type="dxa"/>
-            </w:tcMar>
-          </w:tcPr>
-          <w:p>
-            <w:pPr>
-              <w:spacing w:after="20"/>
-              <w:jc w:val="left"/>
-            </w:pPr>
-            <w:r>
-              <w:rPr>
-                <w:rFonts w:ascii="Times New Roman" w:hAnsi="Times New Roman"/>
-                <w:b w:val="0"/>
-                <w:i w:val="0"/>
-                <w:sz w:val="17"/>
-              </w:rPr>
-              <w:t>BRISC (Sub)</w:t>
-            </w:r>
-          </w:p>
-        </w:tc>
-        <w:tc>
-          <w:tcPr>
-            <w:tcW w:type="dxa" w:w="1129"/>
-            <w:tcMar>
-              <w:top w:w="50" w:type="dxa"/>
-              <w:bottom w:w="50" w:type="dxa"/>
-              <w:left w:w="60" w:type="dxa"/>
-              <w:right w:w="60" w:type="dxa"/>
-            </w:tcMar>
-          </w:tcPr>
-          <w:p>
-            <w:pPr>
-              <w:spacing w:after="20"/>
-              <w:jc w:val="left"/>
-            </w:pPr>
-            <w:r>
-              <w:rPr>
-                <w:rFonts w:ascii="Times New Roman" w:hAnsi="Times New Roman"/>
-                <w:b w:val="0"/>
-                <w:i w:val="0"/>
-                <w:sz w:val="17"/>
-              </w:rPr>
-              <w:t>DeiT-Small (ViT)</w:t>
-            </w:r>
-          </w:p>
-        </w:tc>
-        <w:tc>
-          <w:tcPr>
-            <w:tcW w:type="dxa" w:w="1129"/>
-            <w:tcMar>
-              <w:top w:w="50" w:type="dxa"/>
-              <w:bottom w:w="50" w:type="dxa"/>
-              <w:left w:w="60" w:type="dxa"/>
-              <w:right w:w="60" w:type="dxa"/>
-            </w:tcMar>
-          </w:tcPr>
-          <w:p>
-            <w:pPr>
-              <w:spacing w:after="20"/>
-              <w:jc w:val="left"/>
-            </w:pPr>
-            <w:r>
-              <w:rPr>
-                <w:rFonts w:ascii="Times New Roman" w:hAnsi="Times New Roman"/>
-                <w:b w:val="0"/>
-                <w:i w:val="0"/>
-                <w:sz w:val="17"/>
-              </w:rPr>
-              <w:t>Clean Neoplasm Batch (N=397)</w:t>
-            </w:r>
-          </w:p>
-        </w:tc>
-        <w:tc>
-          <w:tcPr>
-            <w:tcW w:type="dxa" w:w="1129"/>
-            <w:tcMar>
-              <w:top w:w="50" w:type="dxa"/>
-              <w:bottom w:w="50" w:type="dxa"/>
-              <w:left w:w="60" w:type="dxa"/>
-              <w:right w:w="60" w:type="dxa"/>
-            </w:tcMar>
-          </w:tcPr>
-          <w:p>
-            <w:pPr>
-              <w:spacing w:after="20"/>
-              <w:jc w:val="center"/>
-            </w:pPr>
-            <w:r>
-              <w:rPr>
-                <w:rFonts w:ascii="Times New Roman" w:hAnsi="Times New Roman"/>
-                <w:b w:val="0"/>
-                <w:i w:val="0"/>
-                <w:sz w:val="17"/>
-              </w:rPr>
-              <w:t>0.7456</w:t>
-            </w:r>
-          </w:p>
-        </w:tc>
-        <w:tc>
-          <w:tcPr>
-            <w:tcW w:type="dxa" w:w="1129"/>
-            <w:tcMar>
-              <w:top w:w="50" w:type="dxa"/>
-              <w:bottom w:w="50" w:type="dxa"/>
-              <w:left w:w="60" w:type="dxa"/>
-              <w:right w:w="60" w:type="dxa"/>
-            </w:tcMar>
-          </w:tcPr>
-          <w:p>
-            <w:pPr>
-              <w:spacing w:after="20"/>
-              <w:jc w:val="center"/>
-            </w:pPr>
-            <w:r>
-              <w:rPr>
-                <w:rFonts w:ascii="Times New Roman" w:hAnsi="Times New Roman"/>
-                <w:b w:val="0"/>
-                <w:i w:val="0"/>
-                <w:sz w:val="17"/>
-              </w:rPr>
-              <w:t>0.7294</w:t>
-            </w:r>
-          </w:p>
-        </w:tc>
-        <w:tc>
-          <w:tcPr>
-            <w:tcW w:type="dxa" w:w="1129"/>
-            <w:tcMar>
-              <w:top w:w="50" w:type="dxa"/>
-              <w:bottom w:w="50" w:type="dxa"/>
-              <w:left w:w="60" w:type="dxa"/>
-              <w:right w:w="60" w:type="dxa"/>
-            </w:tcMar>
-          </w:tcPr>
-          <w:p>
-            <w:pPr>
-              <w:spacing w:after="20"/>
-              <w:jc w:val="center"/>
-            </w:pPr>
-            <w:r>
-              <w:rPr>
-                <w:rFonts w:ascii="Times New Roman" w:hAnsi="Times New Roman"/>
-                <w:b w:val="0"/>
-                <w:i w:val="0"/>
-                <w:sz w:val="17"/>
-              </w:rPr>
-              <w:t>0.3716</w:t>
-            </w:r>
-          </w:p>
-        </w:tc>
-        <w:tc>
-          <w:tcPr>
-            <w:tcW w:type="dxa" w:w="1129"/>
-            <w:tcMar>
-              <w:top w:w="50" w:type="dxa"/>
-              <w:bottom w:w="50" w:type="dxa"/>
-              <w:left w:w="60" w:type="dxa"/>
-              <w:right w:w="60" w:type="dxa"/>
-            </w:tcMar>
-          </w:tcPr>
-          <w:p>
-            <w:pPr>
-              <w:spacing w:after="20"/>
-              <w:jc w:val="center"/>
-            </w:pPr>
-            <w:r>
-              <w:rPr>
-                <w:rFonts w:ascii="Times New Roman" w:hAnsi="Times New Roman"/>
-                <w:b w:val="0"/>
-                <w:i w:val="0"/>
-                <w:sz w:val="17"/>
-              </w:rPr>
-              <w:t>0.0718</w:t>
-            </w:r>
-          </w:p>
-        </w:tc>
-        <w:tc>
-          <w:tcPr>
-            <w:tcW w:type="dxa" w:w="1129"/>
-            <w:tcMar>
-              <w:top w:w="50" w:type="dxa"/>
-              <w:bottom w:w="50" w:type="dxa"/>
-              <w:left w:w="60" w:type="dxa"/>
-              <w:right w:w="60" w:type="dxa"/>
-            </w:tcMar>
-          </w:tcPr>
-          <w:p>
-            <w:pPr>
-              <w:spacing w:after="20"/>
-              <w:jc w:val="center"/>
-            </w:pPr>
-            <w:r>
-              <w:rPr>
-                <w:rFonts w:ascii="Times New Roman" w:hAnsi="Times New Roman"/>
-                <w:b w:val="0"/>
-                <w:i w:val="0"/>
-                <w:sz w:val="17"/>
-              </w:rPr>
-              <w:t>0.3303</w:t>
-            </w:r>
-          </w:p>
-        </w:tc>
-      </w:tr>
     </w:tbl>
     <w:p>
       <w:pPr>
@@ -4186,7 +3330,7 @@
           <w:i/>
           <w:sz w:val="17"/>
         </w:rPr>
-        <w:t>Note: For Cheng, evaluations reflect the 480 held-out slices of Fold 1 (from 49 patients unseen in training). For BRISC, official and clean benchmark scores are computed across the full 4-class test partitions (N=1,000 and N=899, preserved in predictions/test_predictions_*_brisc.csv and *_brisc_clean.csv), alongside the mask-supported neoplasm evaluation subset (N=480 / N=397, preserved in predictions/test_predictions_*_neoplasm_480.csv).</w:t>
+        <w:t>Note: For Cheng, evaluations reflect the 480 held-out slices of Fold 1 (from 49 patients unseen in training). For BRISC, official and clean benchmark scores are computed across the full 4-class test partitions (N=1,000 and N=899, preserved in predictions/test_predictions_*_brisc.csv and *_brisc_clean.csv), The mask-supported two-class files are used only for the counterfactual audit; they are excluded from benchmark performance comparisons because their original macro-F1 values used an inconsistent four-label averaging convention.</w:t>
       </w:r>
     </w:p>
     <w:p>
@@ -4262,7 +3406,7 @@
           <w:i w:val="0"/>
           <w:sz w:val="20"/>
         </w:rPr>
-        <w:t>Table 2: Regional Evidence Sensitivity and Biostatistical Hypothesis Testing (Recalculated from Raw Observations).</w:t>
+        <w:t>Table 2: Selected Regional Evidence Contrasts and Biostatistical Tests.</w:t>
       </w:r>
     </w:p>
     <w:tbl>
@@ -8324,7 +7468,7 @@
           <w:i w:val="0"/>
           <w:sz w:val="22"/>
         </w:rPr>
-        <w:t>Non-Monotonic Spatial Dynamics and Patient-Clustering Analysis: (1) Core Evidence Dominance vs Method Dependency: Core dominance is strongly evident in Vision Transformers under PDE inpainting on Cheng, where core sensitivity (tau_core = 0.1282) far exceeds margin effects (tau_immediate = 0.0213, tau_outer = 0.0063, tau_remote = 0.0128). However, spatial decay is not universally monotonic across all settings: under Method B (locally matched Gaussian texture fill) and in skull-stripped BRISC scans, outer margin effects frequently approach core sensitivity (e.g. BRISC DeiT outer tau = 0.0301 vs core tau = 0.0517). This occurs because the 12-pixel dilation ring encompasses a substantially larger parenchymal area in skull-stripped scans, capturing extensive vasogenic perilesional edema, and localized convolutional kernels are sensitive to high-frequency boundary textures. (2) Patient-Clustered Statistical Inference: In Cheng, the 45 intervention slices originate from N = 10 unique patient clusters. While slice-level Wilcoxon tests yield p = 9.13 x 10^-6 for DeiT-Small and p = 6.54 x 10^-4 for ResNet-50, patient-clustered analysis across the 10 patient-mean sensitivities yields clustered Wilcoxon p = 0.0488 for both architectures (clustered one-sample t-test: DeiT p = 0.0534, ResNet p = 0.0771). Both levels of inference confirm core sensitivity above sham controls, but patient clustering reveals the true effective degree of freedom (N = 10). (3) Remote Context Invariance: Remote parenchyma interventions produced small shifts indistinguishable from sham controls (p &gt; 0.05). This non-significance indicates that remote tissue does not provide primary directional evidence, though subtle non-specific background dependence cannot be entirely excluded.</w:t>
+        <w:t>Non-Monotonic Spatial Dynamics and Patient-Clustering Analysis: (1) Core Evidence Dominance vs Method Dependency: Core dominance is strongly evident in Vision Transformers under PDE inpainting on Cheng, where core sensitivity (tau_core = 0.1282) far exceeds margin effects (tau_immediate = 0.0213, tau_outer = 0.0063, tau_remote = 0.0128). However, spatial decay is not universally monotonic across all settings: under Method B (locally matched Gaussian texture fill) and in skull-stripped BRISC scans, outer margin effects frequently approach core sensitivity (e.g. BRISC DeiT outer tau = 0.0301 vs core tau = 0.0517). This occurs because the 12-pixel dilation ring encompasses a substantially larger parenchymal area in skull-stripped scans, capturing extensive vasogenic perilesional edema, and localized convolutional kernels are sensitive to high-frequency boundary textures. (2) Patient-Clustered Statistical Inference: In Cheng, the 45 intervention slices originate from N = 10 unique patient clusters. While slice-level Wilcoxon tests yield p = 9.13 x 10^-6 for DeiT-Small and p = 6.54 x 10^-4 for ResNet-50, patient-clustered analysis across the 10 patient-mean sensitivities yields clustered Wilcoxon p = 0.0488 for both architectures (clustered one-sample t-test: DeiT p = 0.0534, ResNet p = 0.0771). The clustered results are borderline (Wilcoxon p = 0.0488; t-test p = 0.0534 for DeiT-Small and 0.0771 for ResNet-50) and are treated as exploratory given the 10-patient effective sample. (3) Remote Context Invariance: Remote parenchyma interventions produced small shifts indistinguishable from sham controls (p &gt; 0.05). This non-significance indicates that remote tissue does not provide primary directional evidence, though subtle non-specific background dependence cannot be entirely excluded.</w:t>
       </w:r>
     </w:p>
     <w:p>
@@ -8355,7 +7499,7 @@
           <w:i w:val="0"/>
           <w:sz w:val="22"/>
         </w:rPr>
-        <w:t>Paired test slice comparisons between DeiT-Small and ResNet-50 revealed systematic inductive bias divergences (Figure 5): (1) Tumour Core Reliance: In the pooled multi-cohort comparison (N = 90, Method A across 55 independent clusters), DeiT-Small exhibited substantially higher sensitivity to the tumour core than ResNet-50 under inpainting (tau_core, ViT = 0.0900 vs tau_core, CNN = 0.0161, difference +0.0738, slice-level Wilcoxon p = 0.0123, Cohen's d_z = 0.362). Crucially, under cluster-level inference accounting for the 55 independent clusters (10 Cheng patient clusters + 45 independent BRISC cases), the architectural superiority remains robust: cluster-level Wilcoxon p = 0.0162, cluster-level t-test p = 0.00177, and Linear Mixed-Effects Modeling fixed effect beta_ViT = +0.074 (z = 3.756, p &lt; 0.001). In the Cheng-specific subset (N = 45), the core sensitivity difference was 0.1282 - 0.0311 = 0.0971 (slice-level Wilcoxon p = 0.156; patient-clustered Wilcoxon p = 0.232, clustered t-test p = 0.148). Statistical significance for architectural divergence is thus achieved when pooling across the combined multi-cohort (N = 90, 55 clusters); (2) Peritumoral Margin Context: DeiT-Small showed higher sensitivity to the immediate margin (+0.0166, p = 0.1124) and outer margin (+0.0118); (3) Remote Context Invariance: Remote sensitivity was near zero for both architectures (tau &lt;= 0.013, difference +0.0072, p = 0.9087), refuting concerns that global self-attention induces spurious sensitivity to distant cranial background tissue.</w:t>
+        <w:t>Paired test slice comparisons between DeiT-Small and ResNet-50 revealed systematic inductive bias divergences (Figure 5): (1) Tumour Core Reliance: In the pooled multi-cohort comparison (N = 90, Method A across 55 independent clusters), DeiT-Small exhibited substantially higher sensitivity to the tumour core than ResNet-50 under inpainting (tau_core, ViT = 0.0900 vs tau_core, CNN = 0.0161, difference +0.0738, slice-level Wilcoxon p = 0.0123, Cohen's d_z = 0.362). Crucially, under cluster-level inference accounting for the 55 independent clusters (10 Cheng patient clusters + 45 independent BRISC cases), the architectural superiority remains robust: cluster-level Wilcoxon p = 0.0162, cluster-level t-test p = 0.00177, and Linear Mixed-Effects Modeling fixed effect beta_ViT = +0.074 (z = 3.756, p &lt; 0.001). In the Cheng-specific subset (N = 45), the core sensitivity difference was 0.1282 - 0.0311 = 0.0971 (slice-level Wilcoxon p = 0.156; patient-clustered Wilcoxon p = 0.232, clustered t-test p = 0.148). The unadjusted pooled contrast should be interpreted cautiously: its Holm-adjusted p value is 0.0980, so the architecture comparison is inconclusive as a confirmatory claim; (2) Peritumoral Margin Context: DeiT-Small showed higher sensitivity to the immediate margin (+0.0166, p = 0.1124) and outer margin (+0.0118); (3) Remote Context Invariance: Remote sensitivity was near zero for both architectures (tau &lt;= 0.013, difference +0.0072, p = 0.9087), providing no evidence in this sample of a difference in remote-context sensitivity.</w:t>
       </w:r>
     </w:p>
     <w:p>
@@ -8431,7 +7575,7 @@
           <w:i w:val="0"/>
           <w:sz w:val="20"/>
         </w:rPr>
-        <w:t>Table 3: Imaging Plane Stratification of Regional Evidence (BRISC).</w:t>
+        <w:t>Table 3: Descriptive BRISC Plane Summary Across Both Architectures and Both Edit Methods.</w:t>
       </w:r>
     </w:p>
     <w:tbl>
@@ -9026,7 +8170,7 @@
           <w:i w:val="0"/>
           <w:sz w:val="20"/>
         </w:rPr>
-        <w:t>Table 4: Tumour Class Heterogeneity and Margin-to-Core Sensitivity Ratios.</w:t>
+        <w:t>Table 4: Exploratory Cheng Class Summary Across Both Architectures and Both Edit Methods.</w:t>
       </w:r>
     </w:p>
     <w:tbl>
@@ -9607,7 +8751,7 @@
           <w:i w:val="0"/>
           <w:sz w:val="22"/>
         </w:rPr>
-        <w:t>Comparing performance between the Contaminated Official Benchmark (N = 1,000) and the Clean De-duplicated Test Set (N = 899) revealed that train-test duplicate leakage significantly altered benchmark evaluations (Table 1; Figure 9). The 101 duplicate test images were heavily skewed toward meningiomas (96 of 101). Deduplication shifted the test set class prior: meningiomas decreased from 30.6% (306/1,000) to 23.4% (210/899). Because classifiers struggled with minority-class separation under severe imbalance, repeated identical meningioma slices in the official test set disproportionately penalized macro-F1 (DeiT-Small: 0.3566; ResNet-50: 0.3460). On the clean benchmark, macro-F1 rose to 0.5999 for DeiT-Small and 0.4181 for ResNet-50. DeiT-Small accuracy improved from 0.6875 to 0.7646, whereas ResNet-50 accuracy shifted from 0.6479 to 0.6292. This demonstrates that duplicate leakage distorts benchmark evaluations primarily by altering class composition priors rather than uniformly inflating nominal scores.</w:t>
+        <w:t>Comparing performance between the Contaminated Official Benchmark (N = 1,000) and the Clean De-duplicated Test Set (N = 899) showed that the locally identified train-test duplicates coincided with different full-test metrics (Table 1; Figure 9). The 101 duplicate test images were heavily skewed toward meningiomas (96 of 101). Deduplication shifted the test set class prior: meningiomas decreased from 30.6% (306/1,000) to 23.4% (210/899). Because classifiers struggled with minority-class separation under severe imbalance, repeated identical meningioma slices in the official test set disproportionately penalized macro-F1 (DeiT-Small: 0.3566; ResNet-50: 0.3460). On the clean benchmark, macro-F1 rose to 0.5999 for DeiT-Small and 0.4181 for ResNet-50. DeiT-Small accuracy improved from 0.6875 to 0.7646, whereas ResNet-50 accuracy shifted from 0.6479 to 0.6292. This demonstrates that duplicate leakage distorts benchmark evaluations primarily by altering class composition priors rather than uniformly inflating nominal scores.</w:t>
       </w:r>
     </w:p>
     <w:p>
@@ -9815,7 +8959,7 @@
           <w:i w:val="0"/>
           <w:sz w:val="21"/>
         </w:rPr>
-        <w:t>This study utilized publicly available, fully de-identified retrospective magnetic resonance imaging datasets [2, 5]. No new human or animal subjects were recruited, and institutional ethical review approval was not required.</w:t>
+        <w:t>This study analysed only publicly available, de-identified retrospective image datasets [2, 5]. It involved no recruitment, intervention, or access to identifiable information. The authors determined that institutional review was not required for this secondary analysis; this determination should be confirmed against the requirements of the target journal and institution before submission.</w:t>
       </w:r>
     </w:p>
     <w:p>
@@ -9884,7 +9028,7 @@
           <w:i w:val="0"/>
           <w:sz w:val="21"/>
         </w:rPr>
-        <w:t>The Cheng dataset is publicly accessible at Figshare (doi:10.6084/m9.figshare.1512427). The BRISC dataset is publicly available at Kaggle and Scientific Data (doi:10.1038/s41597-026-06753-y). Audited manifests, split files, and deduplication mappings are openly provided in the repository.</w:t>
+        <w:t>The Cheng dataset is publicly accessible at Figshare (doi:10.6084/m9.figshare.1512427). BRISC is publicly available at Kaggle and Scientific Data (doi:10.1038/s41597-026-06753-y; CC BY 4.0). Audited manifests, split files, prediction files, and duplicate mappings are available in the project repository: https://github.com/CSrajput-ux/brain-tumor-prediction-using-deep-leaning.</w:t>
       </w:r>
     </w:p>
     <w:p>
@@ -9898,7 +9042,7 @@
           <w:i w:val="0"/>
           <w:sz w:val="21"/>
         </w:rPr>
-        <w:t xml:space="preserve">Code Availability: </w:t>
+        <w:t xml:space="preserve">Code and Checkpoint Availability: </w:t>
       </w:r>
       <w:r>
         <w:rPr>
@@ -9907,7 +9051,30 @@
           <w:i w:val="0"/>
           <w:sz w:val="21"/>
         </w:rPr>
-        <w:t>All source code, preprocessing scripts, model architectures, counterfactual intervention engines, evaluation scripts, and Pytest validation suites are open-source and hosted in the repository.</w:t>
+        <w:t>The project repository contains source code, preprocessing scripts, model configurations, counterfactual engines, evaluation scripts, prediction files, and the local checkpoints used for this analysis: https://github.com/CSrajput-ux/brain-tumor-prediction-using-deep-leaning. A permanent archival DOI and independent reproduction package have not yet been created; they are required before publication.</w:t>
+      </w:r>
+    </w:p>
+    <w:p>
+      <w:pPr>
+        <w:spacing w:after="80" w:line="276" w:lineRule="auto"/>
+      </w:pPr>
+      <w:r>
+        <w:rPr>
+          <w:rFonts w:ascii="Times New Roman" w:hAnsi="Times New Roman"/>
+          <w:b/>
+          <w:i w:val="0"/>
+          <w:sz w:val="21"/>
+        </w:rPr>
+        <w:t xml:space="preserve">Generative AI Use: </w:t>
+      </w:r>
+      <w:r>
+        <w:rPr>
+          <w:rFonts w:ascii="Times New Roman" w:hAnsi="Times New Roman"/>
+          <w:b w:val="0"/>
+          <w:i w:val="0"/>
+          <w:sz w:val="21"/>
+        </w:rPr>
+        <w:t>Generative AI tools were used for language and editorial assistance during manuscript preparation. They were not used to generate study data, images, statistical analyses, or scientific conclusions. The authors reviewed the manuscript and take responsibility for the final content.</w:t>
       </w:r>
     </w:p>
     <w:p>
@@ -10394,7 +9561,7 @@
       <w:r>
         <w:drawing>
           <wp:inline xmlns:a="http://schemas.openxmlformats.org/drawingml/2006/main" xmlns:pic="http://schemas.openxmlformats.org/drawingml/2006/picture">
-            <wp:extent cx="5486400" cy="1956262"/>
+            <wp:extent cx="5486400" cy="1461724"/>
             <wp:docPr id="2" name="Picture 2"/>
             <wp:cNvGraphicFramePr>
               <a:graphicFrameLocks noChangeAspect="1"/>
@@ -10415,7 +9582,7 @@
                   <pic:spPr>
                     <a:xfrm>
                       <a:off x="0" y="0"/>
-                      <a:ext cx="5486400" cy="1956262"/>
+                      <a:ext cx="5486400" cy="1461724"/>
                     </a:xfrm>
                     <a:prstGeom prst="rect"/>
                   </pic:spPr>
@@ -10452,7 +9619,7 @@
       <w:r>
         <w:drawing>
           <wp:inline xmlns:a="http://schemas.openxmlformats.org/drawingml/2006/main" xmlns:pic="http://schemas.openxmlformats.org/drawingml/2006/picture">
-            <wp:extent cx="5486400" cy="2215371"/>
+            <wp:extent cx="5486400" cy="2366419"/>
             <wp:docPr id="3" name="Picture 3"/>
             <wp:cNvGraphicFramePr>
               <a:graphicFrameLocks noChangeAspect="1"/>
@@ -10473,7 +9640,7 @@
                   <pic:spPr>
                     <a:xfrm>
                       <a:off x="0" y="0"/>
-                      <a:ext cx="5486400" cy="2215371"/>
+                      <a:ext cx="5486400" cy="2366419"/>
                     </a:xfrm>
                     <a:prstGeom prst="rect"/>
                   </pic:spPr>

</xml_diff>